<commit_message>
URL Changes Related to miChecker #18
</commit_message>
<xml_diff>
--- a/org.eclipse.actf.examples.michecker.doc.nl1/manual_src/miChecker_eval_guide.docx
+++ b/org.eclipse.actf.examples.michecker.doc.nl1/manual_src/miChecker_eval_guide.docx
@@ -1,6 +1,6 @@
 
 <file path=word/document.xml><?xml version="1.0" encoding="utf-8"?>
-<w:document xmlns:wpc="http://schemas.microsoft.com/office/word/2010/wordprocessingCanvas" xmlns:cx="http://schemas.microsoft.com/office/drawing/2014/chartex" xmlns:cx1="http://schemas.microsoft.com/office/drawing/2015/9/8/chartex" xmlns:cx2="http://schemas.microsoft.com/office/drawing/2015/10/21/chartex" xmlns:cx3="http://schemas.microsoft.com/office/drawing/2016/5/9/chartex" xmlns:cx4="http://schemas.microsoft.com/office/drawing/2016/5/10/chartex" xmlns:cx5="http://schemas.microsoft.com/office/drawing/2016/5/11/chartex" xmlns:cx6="http://schemas.microsoft.com/office/drawing/2016/5/12/chartex" xmlns:cx7="http://schemas.microsoft.com/office/drawing/2016/5/13/chartex" xmlns:cx8="http://schemas.microsoft.com/office/drawing/2016/5/14/chartex" xmlns:mc="http://schemas.openxmlformats.org/markup-compatibility/2006" xmlns:aink="http://schemas.microsoft.com/office/drawing/2016/ink" xmlns:am3d="http://schemas.microsoft.com/office/drawing/2017/model3d" xmlns:o="urn:schemas-microsoft-com:office:office" xmlns:oel="http://schemas.microsoft.com/office/2019/extlst" xmlns:r="http://schemas.openxmlformats.org/officeDocument/2006/relationships" xmlns:m="http://schemas.openxmlformats.org/officeDocument/2006/math" xmlns:v="urn:schemas-microsoft-com:vml" xmlns:wp14="http://schemas.microsoft.com/office/word/2010/wordprocessingDrawing" xmlns:wp="http://schemas.openxmlformats.org/drawingml/2006/wordprocessingDrawing" xmlns:w10="urn:schemas-microsoft-com:office:word" xmlns:w="http://schemas.openxmlformats.org/wordprocessingml/2006/main" xmlns:w14="http://schemas.microsoft.com/office/word/2010/wordml" xmlns:w15="http://schemas.microsoft.com/office/word/2012/wordml" xmlns:w16cex="http://schemas.microsoft.com/office/word/2018/wordml/cex" xmlns:w16cid="http://schemas.microsoft.com/office/word/2016/wordml/cid" xmlns:w16="http://schemas.microsoft.com/office/word/2018/wordml" xmlns:w16sdtdh="http://schemas.microsoft.com/office/word/2020/wordml/sdtdatahash" xmlns:w16se="http://schemas.microsoft.com/office/word/2015/wordml/symex" xmlns:wpg="http://schemas.microsoft.com/office/word/2010/wordprocessingGroup" xmlns:wpi="http://schemas.microsoft.com/office/word/2010/wordprocessingInk" xmlns:wne="http://schemas.microsoft.com/office/word/2006/wordml" xmlns:wps="http://schemas.microsoft.com/office/word/2010/wordprocessingShape" mc:Ignorable="w14 w15 w16se w16cid w16 w16cex w16sdtdh wp14">
+<w:document xmlns:wpc="http://schemas.microsoft.com/office/word/2010/wordprocessingCanvas" xmlns:cx="http://schemas.microsoft.com/office/drawing/2014/chartex" xmlns:cx1="http://schemas.microsoft.com/office/drawing/2015/9/8/chartex" xmlns:cx2="http://schemas.microsoft.com/office/drawing/2015/10/21/chartex" xmlns:cx3="http://schemas.microsoft.com/office/drawing/2016/5/9/chartex" xmlns:cx4="http://schemas.microsoft.com/office/drawing/2016/5/10/chartex" xmlns:cx5="http://schemas.microsoft.com/office/drawing/2016/5/11/chartex" xmlns:cx6="http://schemas.microsoft.com/office/drawing/2016/5/12/chartex" xmlns:cx7="http://schemas.microsoft.com/office/drawing/2016/5/13/chartex" xmlns:cx8="http://schemas.microsoft.com/office/drawing/2016/5/14/chartex" xmlns:mc="http://schemas.openxmlformats.org/markup-compatibility/2006" xmlns:aink="http://schemas.microsoft.com/office/drawing/2016/ink" xmlns:am3d="http://schemas.microsoft.com/office/drawing/2017/model3d" xmlns:o="urn:schemas-microsoft-com:office:office" xmlns:oel="http://schemas.microsoft.com/office/2019/extlst" xmlns:r="http://schemas.openxmlformats.org/officeDocument/2006/relationships" xmlns:m="http://schemas.openxmlformats.org/officeDocument/2006/math" xmlns:v="urn:schemas-microsoft-com:vml" xmlns:wp14="http://schemas.microsoft.com/office/word/2010/wordprocessingDrawing" xmlns:wp="http://schemas.openxmlformats.org/drawingml/2006/wordprocessingDrawing" xmlns:w10="urn:schemas-microsoft-com:office:word" xmlns:w="http://schemas.openxmlformats.org/wordprocessingml/2006/main" xmlns:w14="http://schemas.microsoft.com/office/word/2010/wordml" xmlns:w15="http://schemas.microsoft.com/office/word/2012/wordml" xmlns:w16cex="http://schemas.microsoft.com/office/word/2018/wordml/cex" xmlns:w16cid="http://schemas.microsoft.com/office/word/2016/wordml/cid" xmlns:w16="http://schemas.microsoft.com/office/word/2018/wordml" xmlns:w16du="http://schemas.microsoft.com/office/word/2023/wordml/word16du" xmlns:w16sdtdh="http://schemas.microsoft.com/office/word/2020/wordml/sdtdatahash" xmlns:w16sdtfl="http://schemas.microsoft.com/office/word/2024/wordml/sdtformatlock" xmlns:w16se="http://schemas.microsoft.com/office/word/2015/wordml/symex" xmlns:wpg="http://schemas.microsoft.com/office/word/2010/wordprocessingGroup" xmlns:wpi="http://schemas.microsoft.com/office/word/2010/wordprocessingInk" xmlns:wne="http://schemas.microsoft.com/office/word/2006/wordml" xmlns:wps="http://schemas.microsoft.com/office/word/2010/wordprocessingShape" mc:Ignorable="w14 w15 w16se w16cid w16 w16cex w16sdtdh w16sdtfl w16du wp14">
   <w:body>
     <w:p>
       <w:pPr>
@@ -171,7 +171,7 @@
           <w:sz w:val="28"/>
           <w:szCs w:val="36"/>
         </w:rPr>
-        <w:t>２０２４</w:t>
+        <w:t>２０</w:t>
       </w:r>
       <w:r>
         <w:rPr>
@@ -179,7 +179,7 @@
           <w:sz w:val="28"/>
           <w:szCs w:val="36"/>
         </w:rPr>
-        <w:t>年</w:t>
+        <w:t>２６</w:t>
       </w:r>
       <w:r>
         <w:rPr>
@@ -187,7 +187,7 @@
           <w:sz w:val="28"/>
           <w:szCs w:val="36"/>
         </w:rPr>
-        <w:t>４</w:t>
+        <w:t>年</w:t>
       </w:r>
       <w:r>
         <w:rPr>
@@ -195,6 +195,14 @@
           <w:sz w:val="28"/>
           <w:szCs w:val="36"/>
         </w:rPr>
+        <w:t>６</w:t>
+      </w:r>
+      <w:r>
+        <w:rPr>
+          <w:rFonts w:ascii="ＭＳ Ｐ明朝" w:eastAsia="ＭＳ Ｐ明朝" w:hAnsi="ＭＳ Ｐ明朝" w:cs="Arial" w:hint="eastAsia"/>
+          <w:sz w:val="28"/>
+          <w:szCs w:val="36"/>
+        </w:rPr>
         <w:t>月版</w:t>
       </w:r>
     </w:p>
@@ -298,26 +306,26 @@
       <w:pPr>
         <w:pStyle w:val="10"/>
         <w:rPr>
-          <w:rFonts w:ascii="游ゴシック" w:eastAsia="游ゴシック" w:hAnsi="游ゴシック"/>
+          <w:rFonts w:ascii="Yu Gothic" w:eastAsia="Yu Gothic" w:hAnsi="Yu Gothic"/>
           <w:noProof/>
           <w:szCs w:val="22"/>
         </w:rPr>
       </w:pPr>
       <w:r>
         <w:rPr>
-          <w:rFonts w:ascii="游ゴシック" w:eastAsia="游ゴシック" w:hAnsi="游ゴシック" w:cs="Arial"/>
+          <w:rFonts w:ascii="Yu Gothic" w:eastAsia="Yu Gothic" w:hAnsi="Yu Gothic" w:cs="Arial"/>
         </w:rPr>
         <w:fldChar w:fldCharType="begin"/>
       </w:r>
       <w:r>
         <w:rPr>
-          <w:rFonts w:ascii="游ゴシック" w:eastAsia="游ゴシック" w:hAnsi="游ゴシック" w:cs="Arial"/>
+          <w:rFonts w:ascii="Yu Gothic" w:eastAsia="Yu Gothic" w:hAnsi="Yu Gothic" w:cs="Arial"/>
         </w:rPr>
         <w:instrText xml:space="preserve"> TOC \o "1-3" \h \z \u </w:instrText>
       </w:r>
       <w:r>
         <w:rPr>
-          <w:rFonts w:ascii="游ゴシック" w:eastAsia="游ゴシック" w:hAnsi="游ゴシック" w:cs="Arial"/>
+          <w:rFonts w:ascii="Yu Gothic" w:eastAsia="Yu Gothic" w:hAnsi="Yu Gothic" w:cs="Arial"/>
         </w:rPr>
         <w:fldChar w:fldCharType="separate"/>
       </w:r>
@@ -325,14 +333,14 @@
         <w:r>
           <w:rPr>
             <w:rStyle w:val="a4"/>
-            <w:rFonts w:ascii="游ゴシック" w:eastAsia="游ゴシック" w:hAnsi="游ゴシック" w:cs="Arial"/>
+            <w:rFonts w:ascii="Yu Gothic" w:eastAsia="Yu Gothic" w:hAnsi="Yu Gothic" w:cs="Arial"/>
             <w:noProof/>
           </w:rPr>
           <w:t>はじめに</w:t>
         </w:r>
         <w:r>
           <w:rPr>
-            <w:rFonts w:ascii="游ゴシック" w:eastAsia="游ゴシック" w:hAnsi="游ゴシック"/>
+            <w:rFonts w:ascii="Yu Gothic" w:eastAsia="Yu Gothic" w:hAnsi="Yu Gothic"/>
             <w:noProof/>
             <w:webHidden/>
           </w:rPr>
@@ -340,7 +348,7 @@
         </w:r>
         <w:r>
           <w:rPr>
-            <w:rFonts w:ascii="游ゴシック" w:eastAsia="游ゴシック" w:hAnsi="游ゴシック"/>
+            <w:rFonts w:ascii="Yu Gothic" w:eastAsia="Yu Gothic" w:hAnsi="Yu Gothic"/>
             <w:noProof/>
             <w:webHidden/>
           </w:rPr>
@@ -348,7 +356,7 @@
         </w:r>
         <w:r>
           <w:rPr>
-            <w:rFonts w:ascii="游ゴシック" w:eastAsia="游ゴシック" w:hAnsi="游ゴシック"/>
+            <w:rFonts w:ascii="Yu Gothic" w:eastAsia="Yu Gothic" w:hAnsi="Yu Gothic"/>
             <w:noProof/>
             <w:webHidden/>
           </w:rPr>
@@ -356,14 +364,14 @@
         </w:r>
         <w:r>
           <w:rPr>
-            <w:rFonts w:ascii="游ゴシック" w:eastAsia="游ゴシック" w:hAnsi="游ゴシック"/>
-            <w:noProof/>
-            <w:webHidden/>
-          </w:rPr>
-        </w:r>
-        <w:r>
-          <w:rPr>
-            <w:rFonts w:ascii="游ゴシック" w:eastAsia="游ゴシック" w:hAnsi="游ゴシック"/>
+            <w:rFonts w:ascii="Yu Gothic" w:eastAsia="Yu Gothic" w:hAnsi="Yu Gothic"/>
+            <w:noProof/>
+            <w:webHidden/>
+          </w:rPr>
+        </w:r>
+        <w:r>
+          <w:rPr>
+            <w:rFonts w:ascii="Yu Gothic" w:eastAsia="Yu Gothic" w:hAnsi="Yu Gothic"/>
             <w:noProof/>
             <w:webHidden/>
           </w:rPr>
@@ -371,7 +379,7 @@
         </w:r>
         <w:r>
           <w:rPr>
-            <w:rFonts w:ascii="游ゴシック" w:eastAsia="游ゴシック" w:hAnsi="游ゴシック"/>
+            <w:rFonts w:ascii="Yu Gothic" w:eastAsia="Yu Gothic" w:hAnsi="Yu Gothic"/>
             <w:noProof/>
             <w:webHidden/>
           </w:rPr>
@@ -379,7 +387,7 @@
         </w:r>
         <w:r>
           <w:rPr>
-            <w:rFonts w:ascii="游ゴシック" w:eastAsia="游ゴシック" w:hAnsi="游ゴシック"/>
+            <w:rFonts w:ascii="Yu Gothic" w:eastAsia="Yu Gothic" w:hAnsi="Yu Gothic"/>
             <w:noProof/>
             <w:webHidden/>
           </w:rPr>
@@ -394,7 +402,7 @@
           <w:tab w:val="right" w:leader="dot" w:pos="9900"/>
         </w:tabs>
         <w:rPr>
-          <w:rFonts w:ascii="游ゴシック" w:eastAsia="游ゴシック" w:hAnsi="游ゴシック"/>
+          <w:rFonts w:ascii="Yu Gothic" w:eastAsia="Yu Gothic" w:hAnsi="Yu Gothic"/>
           <w:noProof/>
           <w:szCs w:val="22"/>
         </w:rPr>
@@ -403,14 +411,14 @@
         <w:r>
           <w:rPr>
             <w:rStyle w:val="a4"/>
-            <w:rFonts w:ascii="游ゴシック" w:eastAsia="游ゴシック" w:hAnsi="游ゴシック"/>
+            <w:rFonts w:ascii="Yu Gothic" w:eastAsia="Yu Gothic" w:hAnsi="Yu Gothic"/>
             <w:noProof/>
           </w:rPr>
           <w:t>前提となる知識</w:t>
         </w:r>
         <w:r>
           <w:rPr>
-            <w:rFonts w:ascii="游ゴシック" w:eastAsia="游ゴシック" w:hAnsi="游ゴシック"/>
+            <w:rFonts w:ascii="Yu Gothic" w:eastAsia="Yu Gothic" w:hAnsi="Yu Gothic"/>
             <w:noProof/>
             <w:webHidden/>
           </w:rPr>
@@ -418,7 +426,7 @@
         </w:r>
         <w:r>
           <w:rPr>
-            <w:rFonts w:ascii="游ゴシック" w:eastAsia="游ゴシック" w:hAnsi="游ゴシック"/>
+            <w:rFonts w:ascii="Yu Gothic" w:eastAsia="Yu Gothic" w:hAnsi="Yu Gothic"/>
             <w:noProof/>
             <w:webHidden/>
           </w:rPr>
@@ -426,7 +434,7 @@
         </w:r>
         <w:r>
           <w:rPr>
-            <w:rFonts w:ascii="游ゴシック" w:eastAsia="游ゴシック" w:hAnsi="游ゴシック"/>
+            <w:rFonts w:ascii="Yu Gothic" w:eastAsia="Yu Gothic" w:hAnsi="Yu Gothic"/>
             <w:noProof/>
             <w:webHidden/>
           </w:rPr>
@@ -434,14 +442,14 @@
         </w:r>
         <w:r>
           <w:rPr>
-            <w:rFonts w:ascii="游ゴシック" w:eastAsia="游ゴシック" w:hAnsi="游ゴシック"/>
-            <w:noProof/>
-            <w:webHidden/>
-          </w:rPr>
-        </w:r>
-        <w:r>
-          <w:rPr>
-            <w:rFonts w:ascii="游ゴシック" w:eastAsia="游ゴシック" w:hAnsi="游ゴシック"/>
+            <w:rFonts w:ascii="Yu Gothic" w:eastAsia="Yu Gothic" w:hAnsi="Yu Gothic"/>
+            <w:noProof/>
+            <w:webHidden/>
+          </w:rPr>
+        </w:r>
+        <w:r>
+          <w:rPr>
+            <w:rFonts w:ascii="Yu Gothic" w:eastAsia="Yu Gothic" w:hAnsi="Yu Gothic"/>
             <w:noProof/>
             <w:webHidden/>
           </w:rPr>
@@ -449,7 +457,7 @@
         </w:r>
         <w:r>
           <w:rPr>
-            <w:rFonts w:ascii="游ゴシック" w:eastAsia="游ゴシック" w:hAnsi="游ゴシック"/>
+            <w:rFonts w:ascii="Yu Gothic" w:eastAsia="Yu Gothic" w:hAnsi="Yu Gothic"/>
             <w:noProof/>
             <w:webHidden/>
           </w:rPr>
@@ -457,7 +465,7 @@
         </w:r>
         <w:r>
           <w:rPr>
-            <w:rFonts w:ascii="游ゴシック" w:eastAsia="游ゴシック" w:hAnsi="游ゴシック"/>
+            <w:rFonts w:ascii="Yu Gothic" w:eastAsia="Yu Gothic" w:hAnsi="Yu Gothic"/>
             <w:noProof/>
             <w:webHidden/>
           </w:rPr>
@@ -472,7 +480,7 @@
           <w:tab w:val="right" w:leader="dot" w:pos="9900"/>
         </w:tabs>
         <w:rPr>
-          <w:rFonts w:ascii="游ゴシック" w:eastAsia="游ゴシック" w:hAnsi="游ゴシック"/>
+          <w:rFonts w:ascii="Yu Gothic" w:eastAsia="Yu Gothic" w:hAnsi="Yu Gothic"/>
           <w:noProof/>
           <w:szCs w:val="22"/>
         </w:rPr>
@@ -481,14 +489,14 @@
         <w:r>
           <w:rPr>
             <w:rStyle w:val="a4"/>
-            <w:rFonts w:ascii="游ゴシック" w:eastAsia="游ゴシック" w:hAnsi="游ゴシック" w:cs="Arial"/>
+            <w:rFonts w:ascii="Yu Gothic" w:eastAsia="Yu Gothic" w:hAnsi="Yu Gothic" w:cs="Arial"/>
             <w:noProof/>
           </w:rPr>
           <w:t>事前に必要となるもの</w:t>
         </w:r>
         <w:r>
           <w:rPr>
-            <w:rFonts w:ascii="游ゴシック" w:eastAsia="游ゴシック" w:hAnsi="游ゴシック"/>
+            <w:rFonts w:ascii="Yu Gothic" w:eastAsia="Yu Gothic" w:hAnsi="Yu Gothic"/>
             <w:noProof/>
             <w:webHidden/>
           </w:rPr>
@@ -496,7 +504,7 @@
         </w:r>
         <w:r>
           <w:rPr>
-            <w:rFonts w:ascii="游ゴシック" w:eastAsia="游ゴシック" w:hAnsi="游ゴシック"/>
+            <w:rFonts w:ascii="Yu Gothic" w:eastAsia="Yu Gothic" w:hAnsi="Yu Gothic"/>
             <w:noProof/>
             <w:webHidden/>
           </w:rPr>
@@ -504,7 +512,7 @@
         </w:r>
         <w:r>
           <w:rPr>
-            <w:rFonts w:ascii="游ゴシック" w:eastAsia="游ゴシック" w:hAnsi="游ゴシック"/>
+            <w:rFonts w:ascii="Yu Gothic" w:eastAsia="Yu Gothic" w:hAnsi="Yu Gothic"/>
             <w:noProof/>
             <w:webHidden/>
           </w:rPr>
@@ -512,14 +520,14 @@
         </w:r>
         <w:r>
           <w:rPr>
-            <w:rFonts w:ascii="游ゴシック" w:eastAsia="游ゴシック" w:hAnsi="游ゴシック"/>
-            <w:noProof/>
-            <w:webHidden/>
-          </w:rPr>
-        </w:r>
-        <w:r>
-          <w:rPr>
-            <w:rFonts w:ascii="游ゴシック" w:eastAsia="游ゴシック" w:hAnsi="游ゴシック"/>
+            <w:rFonts w:ascii="Yu Gothic" w:eastAsia="Yu Gothic" w:hAnsi="Yu Gothic"/>
+            <w:noProof/>
+            <w:webHidden/>
+          </w:rPr>
+        </w:r>
+        <w:r>
+          <w:rPr>
+            <w:rFonts w:ascii="Yu Gothic" w:eastAsia="Yu Gothic" w:hAnsi="Yu Gothic"/>
             <w:noProof/>
             <w:webHidden/>
           </w:rPr>
@@ -527,7 +535,7 @@
         </w:r>
         <w:r>
           <w:rPr>
-            <w:rFonts w:ascii="游ゴシック" w:eastAsia="游ゴシック" w:hAnsi="游ゴシック"/>
+            <w:rFonts w:ascii="Yu Gothic" w:eastAsia="Yu Gothic" w:hAnsi="Yu Gothic"/>
             <w:noProof/>
             <w:webHidden/>
           </w:rPr>
@@ -535,7 +543,7 @@
         </w:r>
         <w:r>
           <w:rPr>
-            <w:rFonts w:ascii="游ゴシック" w:eastAsia="游ゴシック" w:hAnsi="游ゴシック"/>
+            <w:rFonts w:ascii="Yu Gothic" w:eastAsia="Yu Gothic" w:hAnsi="Yu Gothic"/>
             <w:noProof/>
             <w:webHidden/>
           </w:rPr>
@@ -547,7 +555,7 @@
       <w:pPr>
         <w:pStyle w:val="10"/>
         <w:rPr>
-          <w:rFonts w:ascii="游ゴシック" w:eastAsia="游ゴシック" w:hAnsi="游ゴシック"/>
+          <w:rFonts w:ascii="Yu Gothic" w:eastAsia="Yu Gothic" w:hAnsi="Yu Gothic"/>
           <w:noProof/>
           <w:szCs w:val="22"/>
         </w:rPr>
@@ -556,14 +564,14 @@
         <w:r>
           <w:rPr>
             <w:rStyle w:val="a4"/>
-            <w:rFonts w:ascii="游ゴシック" w:eastAsia="游ゴシック" w:hAnsi="游ゴシック" w:cs="Arial"/>
+            <w:rFonts w:ascii="Yu Gothic" w:eastAsia="Yu Gothic" w:hAnsi="Yu Gothic" w:cs="Arial"/>
             <w:noProof/>
           </w:rPr>
           <w:t>1.</w:t>
         </w:r>
         <w:r>
           <w:rPr>
-            <w:rFonts w:ascii="游ゴシック" w:eastAsia="游ゴシック" w:hAnsi="游ゴシック"/>
+            <w:rFonts w:ascii="Yu Gothic" w:eastAsia="Yu Gothic" w:hAnsi="Yu Gothic"/>
             <w:noProof/>
             <w:szCs w:val="22"/>
           </w:rPr>
@@ -572,14 +580,14 @@
         <w:r>
           <w:rPr>
             <w:rStyle w:val="a4"/>
-            <w:rFonts w:ascii="游ゴシック" w:eastAsia="游ゴシック" w:hAnsi="游ゴシック"/>
+            <w:rFonts w:ascii="Yu Gothic" w:eastAsia="Yu Gothic" w:hAnsi="Yu Gothic"/>
             <w:noProof/>
           </w:rPr>
           <w:t>試験作業の準備</w:t>
         </w:r>
         <w:r>
           <w:rPr>
-            <w:rFonts w:ascii="游ゴシック" w:eastAsia="游ゴシック" w:hAnsi="游ゴシック"/>
+            <w:rFonts w:ascii="Yu Gothic" w:eastAsia="Yu Gothic" w:hAnsi="Yu Gothic"/>
             <w:noProof/>
             <w:webHidden/>
           </w:rPr>
@@ -587,7 +595,7 @@
         </w:r>
         <w:r>
           <w:rPr>
-            <w:rFonts w:ascii="游ゴシック" w:eastAsia="游ゴシック" w:hAnsi="游ゴシック"/>
+            <w:rFonts w:ascii="Yu Gothic" w:eastAsia="Yu Gothic" w:hAnsi="Yu Gothic"/>
             <w:noProof/>
             <w:webHidden/>
           </w:rPr>
@@ -595,7 +603,7 @@
         </w:r>
         <w:r>
           <w:rPr>
-            <w:rFonts w:ascii="游ゴシック" w:eastAsia="游ゴシック" w:hAnsi="游ゴシック"/>
+            <w:rFonts w:ascii="Yu Gothic" w:eastAsia="Yu Gothic" w:hAnsi="Yu Gothic"/>
             <w:noProof/>
             <w:webHidden/>
           </w:rPr>
@@ -603,14 +611,14 @@
         </w:r>
         <w:r>
           <w:rPr>
-            <w:rFonts w:ascii="游ゴシック" w:eastAsia="游ゴシック" w:hAnsi="游ゴシック"/>
-            <w:noProof/>
-            <w:webHidden/>
-          </w:rPr>
-        </w:r>
-        <w:r>
-          <w:rPr>
-            <w:rFonts w:ascii="游ゴシック" w:eastAsia="游ゴシック" w:hAnsi="游ゴシック"/>
+            <w:rFonts w:ascii="Yu Gothic" w:eastAsia="Yu Gothic" w:hAnsi="Yu Gothic"/>
+            <w:noProof/>
+            <w:webHidden/>
+          </w:rPr>
+        </w:r>
+        <w:r>
+          <w:rPr>
+            <w:rFonts w:ascii="Yu Gothic" w:eastAsia="Yu Gothic" w:hAnsi="Yu Gothic"/>
             <w:noProof/>
             <w:webHidden/>
           </w:rPr>
@@ -618,7 +626,7 @@
         </w:r>
         <w:r>
           <w:rPr>
-            <w:rFonts w:ascii="游ゴシック" w:eastAsia="游ゴシック" w:hAnsi="游ゴシック"/>
+            <w:rFonts w:ascii="Yu Gothic" w:eastAsia="Yu Gothic" w:hAnsi="Yu Gothic"/>
             <w:noProof/>
             <w:webHidden/>
           </w:rPr>
@@ -626,7 +634,7 @@
         </w:r>
         <w:r>
           <w:rPr>
-            <w:rFonts w:ascii="游ゴシック" w:eastAsia="游ゴシック" w:hAnsi="游ゴシック"/>
+            <w:rFonts w:ascii="Yu Gothic" w:eastAsia="Yu Gothic" w:hAnsi="Yu Gothic"/>
             <w:noProof/>
             <w:webHidden/>
           </w:rPr>
@@ -642,7 +650,7 @@
           <w:tab w:val="right" w:leader="dot" w:pos="9900"/>
         </w:tabs>
         <w:rPr>
-          <w:rFonts w:ascii="游ゴシック" w:eastAsia="游ゴシック" w:hAnsi="游ゴシック"/>
+          <w:rFonts w:ascii="Yu Gothic" w:eastAsia="Yu Gothic" w:hAnsi="Yu Gothic"/>
           <w:noProof/>
           <w:szCs w:val="22"/>
         </w:rPr>
@@ -651,14 +659,14 @@
         <w:r>
           <w:rPr>
             <w:rStyle w:val="a4"/>
-            <w:rFonts w:ascii="游ゴシック" w:eastAsia="游ゴシック" w:hAnsi="游ゴシック" w:cs="Arial"/>
+            <w:rFonts w:ascii="Yu Gothic" w:eastAsia="Yu Gothic" w:hAnsi="Yu Gothic" w:cs="Arial"/>
             <w:noProof/>
           </w:rPr>
           <w:t>1.1</w:t>
         </w:r>
         <w:r>
           <w:rPr>
-            <w:rFonts w:ascii="游ゴシック" w:eastAsia="游ゴシック" w:hAnsi="游ゴシック"/>
+            <w:rFonts w:ascii="Yu Gothic" w:eastAsia="Yu Gothic" w:hAnsi="Yu Gothic"/>
             <w:noProof/>
             <w:szCs w:val="22"/>
           </w:rPr>
@@ -667,14 +675,14 @@
         <w:r>
           <w:rPr>
             <w:rStyle w:val="a4"/>
-            <w:rFonts w:ascii="游ゴシック" w:eastAsia="游ゴシック" w:hAnsi="游ゴシック" w:cs="Arial"/>
+            <w:rFonts w:ascii="Yu Gothic" w:eastAsia="Yu Gothic" w:hAnsi="Yu Gothic" w:cs="Arial"/>
             <w:noProof/>
           </w:rPr>
           <w:t>使用している達成方法及びその検証方法の一覧 (例： 実装チェックリスト) の準備</w:t>
         </w:r>
         <w:r>
           <w:rPr>
-            <w:rFonts w:ascii="游ゴシック" w:eastAsia="游ゴシック" w:hAnsi="游ゴシック"/>
+            <w:rFonts w:ascii="Yu Gothic" w:eastAsia="Yu Gothic" w:hAnsi="Yu Gothic"/>
             <w:noProof/>
             <w:webHidden/>
           </w:rPr>
@@ -682,7 +690,7 @@
         </w:r>
         <w:r>
           <w:rPr>
-            <w:rFonts w:ascii="游ゴシック" w:eastAsia="游ゴシック" w:hAnsi="游ゴシック"/>
+            <w:rFonts w:ascii="Yu Gothic" w:eastAsia="Yu Gothic" w:hAnsi="Yu Gothic"/>
             <w:noProof/>
             <w:webHidden/>
           </w:rPr>
@@ -690,7 +698,7 @@
         </w:r>
         <w:r>
           <w:rPr>
-            <w:rFonts w:ascii="游ゴシック" w:eastAsia="游ゴシック" w:hAnsi="游ゴシック"/>
+            <w:rFonts w:ascii="Yu Gothic" w:eastAsia="Yu Gothic" w:hAnsi="Yu Gothic"/>
             <w:noProof/>
             <w:webHidden/>
           </w:rPr>
@@ -698,14 +706,14 @@
         </w:r>
         <w:r>
           <w:rPr>
-            <w:rFonts w:ascii="游ゴシック" w:eastAsia="游ゴシック" w:hAnsi="游ゴシック"/>
-            <w:noProof/>
-            <w:webHidden/>
-          </w:rPr>
-        </w:r>
-        <w:r>
-          <w:rPr>
-            <w:rFonts w:ascii="游ゴシック" w:eastAsia="游ゴシック" w:hAnsi="游ゴシック"/>
+            <w:rFonts w:ascii="Yu Gothic" w:eastAsia="Yu Gothic" w:hAnsi="Yu Gothic"/>
+            <w:noProof/>
+            <w:webHidden/>
+          </w:rPr>
+        </w:r>
+        <w:r>
+          <w:rPr>
+            <w:rFonts w:ascii="Yu Gothic" w:eastAsia="Yu Gothic" w:hAnsi="Yu Gothic"/>
             <w:noProof/>
             <w:webHidden/>
           </w:rPr>
@@ -713,7 +721,7 @@
         </w:r>
         <w:r>
           <w:rPr>
-            <w:rFonts w:ascii="游ゴシック" w:eastAsia="游ゴシック" w:hAnsi="游ゴシック"/>
+            <w:rFonts w:ascii="Yu Gothic" w:eastAsia="Yu Gothic" w:hAnsi="Yu Gothic"/>
             <w:noProof/>
             <w:webHidden/>
           </w:rPr>
@@ -721,7 +729,7 @@
         </w:r>
         <w:r>
           <w:rPr>
-            <w:rFonts w:ascii="游ゴシック" w:eastAsia="游ゴシック" w:hAnsi="游ゴシック"/>
+            <w:rFonts w:ascii="Yu Gothic" w:eastAsia="Yu Gothic" w:hAnsi="Yu Gothic"/>
             <w:noProof/>
             <w:webHidden/>
           </w:rPr>
@@ -736,7 +744,7 @@
           <w:tab w:val="right" w:leader="dot" w:pos="9900"/>
         </w:tabs>
         <w:rPr>
-          <w:rFonts w:ascii="游ゴシック" w:eastAsia="游ゴシック" w:hAnsi="游ゴシック"/>
+          <w:rFonts w:ascii="Yu Gothic" w:eastAsia="Yu Gothic" w:hAnsi="Yu Gothic"/>
           <w:noProof/>
           <w:szCs w:val="22"/>
         </w:rPr>
@@ -745,14 +753,14 @@
         <w:r>
           <w:rPr>
             <w:rStyle w:val="a4"/>
-            <w:rFonts w:ascii="游ゴシック" w:eastAsia="游ゴシック" w:hAnsi="游ゴシック"/>
+            <w:rFonts w:ascii="Yu Gothic" w:eastAsia="Yu Gothic" w:hAnsi="Yu Gothic"/>
             <w:noProof/>
           </w:rPr>
           <w:t>（コラム）実装チェックリスト</w:t>
         </w:r>
         <w:r>
           <w:rPr>
-            <w:rFonts w:ascii="游ゴシック" w:eastAsia="游ゴシック" w:hAnsi="游ゴシック"/>
+            <w:rFonts w:ascii="Yu Gothic" w:eastAsia="Yu Gothic" w:hAnsi="Yu Gothic"/>
             <w:noProof/>
             <w:webHidden/>
           </w:rPr>
@@ -760,7 +768,7 @@
         </w:r>
         <w:r>
           <w:rPr>
-            <w:rFonts w:ascii="游ゴシック" w:eastAsia="游ゴシック" w:hAnsi="游ゴシック"/>
+            <w:rFonts w:ascii="Yu Gothic" w:eastAsia="Yu Gothic" w:hAnsi="Yu Gothic"/>
             <w:noProof/>
             <w:webHidden/>
           </w:rPr>
@@ -768,7 +776,7 @@
         </w:r>
         <w:r>
           <w:rPr>
-            <w:rFonts w:ascii="游ゴシック" w:eastAsia="游ゴシック" w:hAnsi="游ゴシック"/>
+            <w:rFonts w:ascii="Yu Gothic" w:eastAsia="Yu Gothic" w:hAnsi="Yu Gothic"/>
             <w:noProof/>
             <w:webHidden/>
           </w:rPr>
@@ -776,14 +784,14 @@
         </w:r>
         <w:r>
           <w:rPr>
-            <w:rFonts w:ascii="游ゴシック" w:eastAsia="游ゴシック" w:hAnsi="游ゴシック"/>
-            <w:noProof/>
-            <w:webHidden/>
-          </w:rPr>
-        </w:r>
-        <w:r>
-          <w:rPr>
-            <w:rFonts w:ascii="游ゴシック" w:eastAsia="游ゴシック" w:hAnsi="游ゴシック"/>
+            <w:rFonts w:ascii="Yu Gothic" w:eastAsia="Yu Gothic" w:hAnsi="Yu Gothic"/>
+            <w:noProof/>
+            <w:webHidden/>
+          </w:rPr>
+        </w:r>
+        <w:r>
+          <w:rPr>
+            <w:rFonts w:ascii="Yu Gothic" w:eastAsia="Yu Gothic" w:hAnsi="Yu Gothic"/>
             <w:noProof/>
             <w:webHidden/>
           </w:rPr>
@@ -791,7 +799,7 @@
         </w:r>
         <w:r>
           <w:rPr>
-            <w:rFonts w:ascii="游ゴシック" w:eastAsia="游ゴシック" w:hAnsi="游ゴシック"/>
+            <w:rFonts w:ascii="Yu Gothic" w:eastAsia="Yu Gothic" w:hAnsi="Yu Gothic"/>
             <w:noProof/>
             <w:webHidden/>
           </w:rPr>
@@ -799,7 +807,7 @@
         </w:r>
         <w:r>
           <w:rPr>
-            <w:rFonts w:ascii="游ゴシック" w:eastAsia="游ゴシック" w:hAnsi="游ゴシック"/>
+            <w:rFonts w:ascii="Yu Gothic" w:eastAsia="Yu Gothic" w:hAnsi="Yu Gothic"/>
             <w:noProof/>
             <w:webHidden/>
           </w:rPr>
@@ -815,7 +823,7 @@
           <w:tab w:val="right" w:leader="dot" w:pos="9900"/>
         </w:tabs>
         <w:rPr>
-          <w:rFonts w:ascii="游ゴシック" w:eastAsia="游ゴシック" w:hAnsi="游ゴシック"/>
+          <w:rFonts w:ascii="Yu Gothic" w:eastAsia="Yu Gothic" w:hAnsi="Yu Gothic"/>
           <w:noProof/>
           <w:szCs w:val="22"/>
         </w:rPr>
@@ -824,14 +832,14 @@
         <w:r>
           <w:rPr>
             <w:rStyle w:val="a4"/>
-            <w:rFonts w:ascii="游ゴシック" w:eastAsia="游ゴシック" w:hAnsi="游ゴシック" w:cs="Arial"/>
+            <w:rFonts w:ascii="Yu Gothic" w:eastAsia="Yu Gothic" w:hAnsi="Yu Gothic" w:cs="Arial"/>
             <w:noProof/>
           </w:rPr>
           <w:t>1.2</w:t>
         </w:r>
         <w:r>
           <w:rPr>
-            <w:rFonts w:ascii="游ゴシック" w:eastAsia="游ゴシック" w:hAnsi="游ゴシック"/>
+            <w:rFonts w:ascii="Yu Gothic" w:eastAsia="Yu Gothic" w:hAnsi="Yu Gothic"/>
             <w:noProof/>
             <w:szCs w:val="22"/>
           </w:rPr>
@@ -840,14 +848,14 @@
         <w:r>
           <w:rPr>
             <w:rStyle w:val="a4"/>
-            <w:rFonts w:ascii="游ゴシック" w:eastAsia="游ゴシック" w:hAnsi="游ゴシック"/>
+            <w:rFonts w:ascii="Yu Gothic" w:eastAsia="Yu Gothic" w:hAnsi="Yu Gothic"/>
             <w:noProof/>
           </w:rPr>
           <w:t>miCheckerの準備</w:t>
         </w:r>
         <w:r>
           <w:rPr>
-            <w:rFonts w:ascii="游ゴシック" w:eastAsia="游ゴシック" w:hAnsi="游ゴシック"/>
+            <w:rFonts w:ascii="Yu Gothic" w:eastAsia="Yu Gothic" w:hAnsi="Yu Gothic"/>
             <w:noProof/>
             <w:webHidden/>
           </w:rPr>
@@ -855,7 +863,7 @@
         </w:r>
         <w:r>
           <w:rPr>
-            <w:rFonts w:ascii="游ゴシック" w:eastAsia="游ゴシック" w:hAnsi="游ゴシック"/>
+            <w:rFonts w:ascii="Yu Gothic" w:eastAsia="Yu Gothic" w:hAnsi="Yu Gothic"/>
             <w:noProof/>
             <w:webHidden/>
           </w:rPr>
@@ -863,7 +871,7 @@
         </w:r>
         <w:r>
           <w:rPr>
-            <w:rFonts w:ascii="游ゴシック" w:eastAsia="游ゴシック" w:hAnsi="游ゴシック"/>
+            <w:rFonts w:ascii="Yu Gothic" w:eastAsia="Yu Gothic" w:hAnsi="Yu Gothic"/>
             <w:noProof/>
             <w:webHidden/>
           </w:rPr>
@@ -871,14 +879,14 @@
         </w:r>
         <w:r>
           <w:rPr>
-            <w:rFonts w:ascii="游ゴシック" w:eastAsia="游ゴシック" w:hAnsi="游ゴシック"/>
-            <w:noProof/>
-            <w:webHidden/>
-          </w:rPr>
-        </w:r>
-        <w:r>
-          <w:rPr>
-            <w:rFonts w:ascii="游ゴシック" w:eastAsia="游ゴシック" w:hAnsi="游ゴシック"/>
+            <w:rFonts w:ascii="Yu Gothic" w:eastAsia="Yu Gothic" w:hAnsi="Yu Gothic"/>
+            <w:noProof/>
+            <w:webHidden/>
+          </w:rPr>
+        </w:r>
+        <w:r>
+          <w:rPr>
+            <w:rFonts w:ascii="Yu Gothic" w:eastAsia="Yu Gothic" w:hAnsi="Yu Gothic"/>
             <w:noProof/>
             <w:webHidden/>
           </w:rPr>
@@ -886,7 +894,7 @@
         </w:r>
         <w:r>
           <w:rPr>
-            <w:rFonts w:ascii="游ゴシック" w:eastAsia="游ゴシック" w:hAnsi="游ゴシック"/>
+            <w:rFonts w:ascii="Yu Gothic" w:eastAsia="Yu Gothic" w:hAnsi="Yu Gothic"/>
             <w:noProof/>
             <w:webHidden/>
           </w:rPr>
@@ -894,7 +902,7 @@
         </w:r>
         <w:r>
           <w:rPr>
-            <w:rFonts w:ascii="游ゴシック" w:eastAsia="游ゴシック" w:hAnsi="游ゴシック"/>
+            <w:rFonts w:ascii="Yu Gothic" w:eastAsia="Yu Gothic" w:hAnsi="Yu Gothic"/>
             <w:noProof/>
             <w:webHidden/>
           </w:rPr>
@@ -909,7 +917,7 @@
           <w:tab w:val="right" w:leader="dot" w:pos="9900"/>
         </w:tabs>
         <w:rPr>
-          <w:rFonts w:ascii="游ゴシック" w:eastAsia="游ゴシック" w:hAnsi="游ゴシック"/>
+          <w:rFonts w:ascii="Yu Gothic" w:eastAsia="Yu Gothic" w:hAnsi="Yu Gothic"/>
           <w:noProof/>
           <w:szCs w:val="22"/>
         </w:rPr>
@@ -918,14 +926,14 @@
         <w:r>
           <w:rPr>
             <w:rStyle w:val="a4"/>
-            <w:rFonts w:ascii="游ゴシック" w:eastAsia="游ゴシック" w:hAnsi="游ゴシック"/>
+            <w:rFonts w:ascii="Yu Gothic" w:eastAsia="Yu Gothic" w:hAnsi="Yu Gothic"/>
             <w:noProof/>
           </w:rPr>
           <w:t>（コラム）miChecker利用ガイド</w:t>
         </w:r>
         <w:r>
           <w:rPr>
-            <w:rFonts w:ascii="游ゴシック" w:eastAsia="游ゴシック" w:hAnsi="游ゴシック"/>
+            <w:rFonts w:ascii="Yu Gothic" w:eastAsia="Yu Gothic" w:hAnsi="Yu Gothic"/>
             <w:noProof/>
             <w:webHidden/>
           </w:rPr>
@@ -933,7 +941,7 @@
         </w:r>
         <w:r>
           <w:rPr>
-            <w:rFonts w:ascii="游ゴシック" w:eastAsia="游ゴシック" w:hAnsi="游ゴシック"/>
+            <w:rFonts w:ascii="Yu Gothic" w:eastAsia="Yu Gothic" w:hAnsi="Yu Gothic"/>
             <w:noProof/>
             <w:webHidden/>
           </w:rPr>
@@ -941,7 +949,7 @@
         </w:r>
         <w:r>
           <w:rPr>
-            <w:rFonts w:ascii="游ゴシック" w:eastAsia="游ゴシック" w:hAnsi="游ゴシック"/>
+            <w:rFonts w:ascii="Yu Gothic" w:eastAsia="Yu Gothic" w:hAnsi="Yu Gothic"/>
             <w:noProof/>
             <w:webHidden/>
           </w:rPr>
@@ -949,14 +957,14 @@
         </w:r>
         <w:r>
           <w:rPr>
-            <w:rFonts w:ascii="游ゴシック" w:eastAsia="游ゴシック" w:hAnsi="游ゴシック"/>
-            <w:noProof/>
-            <w:webHidden/>
-          </w:rPr>
-        </w:r>
-        <w:r>
-          <w:rPr>
-            <w:rFonts w:ascii="游ゴシック" w:eastAsia="游ゴシック" w:hAnsi="游ゴシック"/>
+            <w:rFonts w:ascii="Yu Gothic" w:eastAsia="Yu Gothic" w:hAnsi="Yu Gothic"/>
+            <w:noProof/>
+            <w:webHidden/>
+          </w:rPr>
+        </w:r>
+        <w:r>
+          <w:rPr>
+            <w:rFonts w:ascii="Yu Gothic" w:eastAsia="Yu Gothic" w:hAnsi="Yu Gothic"/>
             <w:noProof/>
             <w:webHidden/>
           </w:rPr>
@@ -964,7 +972,7 @@
         </w:r>
         <w:r>
           <w:rPr>
-            <w:rFonts w:ascii="游ゴシック" w:eastAsia="游ゴシック" w:hAnsi="游ゴシック"/>
+            <w:rFonts w:ascii="Yu Gothic" w:eastAsia="Yu Gothic" w:hAnsi="Yu Gothic"/>
             <w:noProof/>
             <w:webHidden/>
           </w:rPr>
@@ -972,7 +980,7 @@
         </w:r>
         <w:r>
           <w:rPr>
-            <w:rFonts w:ascii="游ゴシック" w:eastAsia="游ゴシック" w:hAnsi="游ゴシック"/>
+            <w:rFonts w:ascii="Yu Gothic" w:eastAsia="Yu Gothic" w:hAnsi="Yu Gothic"/>
             <w:noProof/>
             <w:webHidden/>
           </w:rPr>
@@ -988,7 +996,7 @@
           <w:tab w:val="right" w:leader="dot" w:pos="9900"/>
         </w:tabs>
         <w:rPr>
-          <w:rFonts w:ascii="游ゴシック" w:eastAsia="游ゴシック" w:hAnsi="游ゴシック"/>
+          <w:rFonts w:ascii="Yu Gothic" w:eastAsia="Yu Gothic" w:hAnsi="Yu Gothic"/>
           <w:noProof/>
           <w:szCs w:val="22"/>
         </w:rPr>
@@ -997,14 +1005,14 @@
         <w:r>
           <w:rPr>
             <w:rStyle w:val="a4"/>
-            <w:rFonts w:ascii="游ゴシック" w:eastAsia="游ゴシック" w:hAnsi="游ゴシック" w:cs="Arial"/>
+            <w:rFonts w:ascii="Yu Gothic" w:eastAsia="Yu Gothic" w:hAnsi="Yu Gothic" w:cs="Arial"/>
             <w:noProof/>
           </w:rPr>
           <w:t>1.3</w:t>
         </w:r>
         <w:r>
           <w:rPr>
-            <w:rFonts w:ascii="游ゴシック" w:eastAsia="游ゴシック" w:hAnsi="游ゴシック"/>
+            <w:rFonts w:ascii="Yu Gothic" w:eastAsia="Yu Gothic" w:hAnsi="Yu Gothic"/>
             <w:noProof/>
             <w:szCs w:val="22"/>
           </w:rPr>
@@ -1013,14 +1021,14 @@
         <w:r>
           <w:rPr>
             <w:rStyle w:val="a4"/>
-            <w:rFonts w:ascii="游ゴシック" w:eastAsia="游ゴシック" w:hAnsi="游ゴシック"/>
+            <w:rFonts w:ascii="Yu Gothic" w:eastAsia="Yu Gothic" w:hAnsi="Yu Gothic"/>
             <w:noProof/>
           </w:rPr>
           <w:t>miCheckerワークシートの準備</w:t>
         </w:r>
         <w:r>
           <w:rPr>
-            <w:rFonts w:ascii="游ゴシック" w:eastAsia="游ゴシック" w:hAnsi="游ゴシック"/>
+            <w:rFonts w:ascii="Yu Gothic" w:eastAsia="Yu Gothic" w:hAnsi="Yu Gothic"/>
             <w:noProof/>
             <w:webHidden/>
           </w:rPr>
@@ -1028,7 +1036,7 @@
         </w:r>
         <w:r>
           <w:rPr>
-            <w:rFonts w:ascii="游ゴシック" w:eastAsia="游ゴシック" w:hAnsi="游ゴシック"/>
+            <w:rFonts w:ascii="Yu Gothic" w:eastAsia="Yu Gothic" w:hAnsi="Yu Gothic"/>
             <w:noProof/>
             <w:webHidden/>
           </w:rPr>
@@ -1036,7 +1044,7 @@
         </w:r>
         <w:r>
           <w:rPr>
-            <w:rFonts w:ascii="游ゴシック" w:eastAsia="游ゴシック" w:hAnsi="游ゴシック"/>
+            <w:rFonts w:ascii="Yu Gothic" w:eastAsia="Yu Gothic" w:hAnsi="Yu Gothic"/>
             <w:noProof/>
             <w:webHidden/>
           </w:rPr>
@@ -1044,14 +1052,14 @@
         </w:r>
         <w:r>
           <w:rPr>
-            <w:rFonts w:ascii="游ゴシック" w:eastAsia="游ゴシック" w:hAnsi="游ゴシック"/>
-            <w:noProof/>
-            <w:webHidden/>
-          </w:rPr>
-        </w:r>
-        <w:r>
-          <w:rPr>
-            <w:rFonts w:ascii="游ゴシック" w:eastAsia="游ゴシック" w:hAnsi="游ゴシック"/>
+            <w:rFonts w:ascii="Yu Gothic" w:eastAsia="Yu Gothic" w:hAnsi="Yu Gothic"/>
+            <w:noProof/>
+            <w:webHidden/>
+          </w:rPr>
+        </w:r>
+        <w:r>
+          <w:rPr>
+            <w:rFonts w:ascii="Yu Gothic" w:eastAsia="Yu Gothic" w:hAnsi="Yu Gothic"/>
             <w:noProof/>
             <w:webHidden/>
           </w:rPr>
@@ -1059,7 +1067,7 @@
         </w:r>
         <w:r>
           <w:rPr>
-            <w:rFonts w:ascii="游ゴシック" w:eastAsia="游ゴシック" w:hAnsi="游ゴシック"/>
+            <w:rFonts w:ascii="Yu Gothic" w:eastAsia="Yu Gothic" w:hAnsi="Yu Gothic"/>
             <w:noProof/>
             <w:webHidden/>
           </w:rPr>
@@ -1067,7 +1075,7 @@
         </w:r>
         <w:r>
           <w:rPr>
-            <w:rFonts w:ascii="游ゴシック" w:eastAsia="游ゴシック" w:hAnsi="游ゴシック"/>
+            <w:rFonts w:ascii="Yu Gothic" w:eastAsia="Yu Gothic" w:hAnsi="Yu Gothic"/>
             <w:noProof/>
             <w:webHidden/>
           </w:rPr>
@@ -1082,7 +1090,7 @@
           <w:tab w:val="right" w:leader="dot" w:pos="9900"/>
         </w:tabs>
         <w:rPr>
-          <w:rFonts w:ascii="游ゴシック" w:eastAsia="游ゴシック" w:hAnsi="游ゴシック"/>
+          <w:rFonts w:ascii="Yu Gothic" w:eastAsia="Yu Gothic" w:hAnsi="Yu Gothic"/>
           <w:noProof/>
           <w:szCs w:val="22"/>
         </w:rPr>
@@ -1091,7 +1099,7 @@
         <w:r>
           <w:rPr>
             <w:rStyle w:val="a4"/>
-            <w:rFonts w:ascii="游ゴシック" w:eastAsia="游ゴシック" w:hAnsi="游ゴシック"/>
+            <w:rFonts w:ascii="Yu Gothic" w:eastAsia="Yu Gothic" w:hAnsi="Yu Gothic"/>
             <w:noProof/>
           </w:rPr>
           <w:t>（コラム）</w:t>
@@ -1099,14 +1107,14 @@
         <w:r>
           <w:rPr>
             <w:rStyle w:val="a4"/>
-            <w:rFonts w:ascii="游ゴシック" w:eastAsia="游ゴシック" w:hAnsi="游ゴシック" w:cs="Arial"/>
+            <w:rFonts w:ascii="Yu Gothic" w:eastAsia="Yu Gothic" w:hAnsi="Yu Gothic" w:cs="Arial"/>
             <w:noProof/>
           </w:rPr>
           <w:t>miCheckerワークシート</w:t>
         </w:r>
         <w:r>
           <w:rPr>
-            <w:rFonts w:ascii="游ゴシック" w:eastAsia="游ゴシック" w:hAnsi="游ゴシック"/>
+            <w:rFonts w:ascii="Yu Gothic" w:eastAsia="Yu Gothic" w:hAnsi="Yu Gothic"/>
             <w:noProof/>
             <w:webHidden/>
           </w:rPr>
@@ -1114,7 +1122,7 @@
         </w:r>
         <w:r>
           <w:rPr>
-            <w:rFonts w:ascii="游ゴシック" w:eastAsia="游ゴシック" w:hAnsi="游ゴシック"/>
+            <w:rFonts w:ascii="Yu Gothic" w:eastAsia="Yu Gothic" w:hAnsi="Yu Gothic"/>
             <w:noProof/>
             <w:webHidden/>
           </w:rPr>
@@ -1122,7 +1130,7 @@
         </w:r>
         <w:r>
           <w:rPr>
-            <w:rFonts w:ascii="游ゴシック" w:eastAsia="游ゴシック" w:hAnsi="游ゴシック"/>
+            <w:rFonts w:ascii="Yu Gothic" w:eastAsia="Yu Gothic" w:hAnsi="Yu Gothic"/>
             <w:noProof/>
             <w:webHidden/>
           </w:rPr>
@@ -1130,14 +1138,14 @@
         </w:r>
         <w:r>
           <w:rPr>
-            <w:rFonts w:ascii="游ゴシック" w:eastAsia="游ゴシック" w:hAnsi="游ゴシック"/>
-            <w:noProof/>
-            <w:webHidden/>
-          </w:rPr>
-        </w:r>
-        <w:r>
-          <w:rPr>
-            <w:rFonts w:ascii="游ゴシック" w:eastAsia="游ゴシック" w:hAnsi="游ゴシック"/>
+            <w:rFonts w:ascii="Yu Gothic" w:eastAsia="Yu Gothic" w:hAnsi="Yu Gothic"/>
+            <w:noProof/>
+            <w:webHidden/>
+          </w:rPr>
+        </w:r>
+        <w:r>
+          <w:rPr>
+            <w:rFonts w:ascii="Yu Gothic" w:eastAsia="Yu Gothic" w:hAnsi="Yu Gothic"/>
             <w:noProof/>
             <w:webHidden/>
           </w:rPr>
@@ -1145,7 +1153,7 @@
         </w:r>
         <w:r>
           <w:rPr>
-            <w:rFonts w:ascii="游ゴシック" w:eastAsia="游ゴシック" w:hAnsi="游ゴシック"/>
+            <w:rFonts w:ascii="Yu Gothic" w:eastAsia="Yu Gothic" w:hAnsi="Yu Gothic"/>
             <w:noProof/>
             <w:webHidden/>
           </w:rPr>
@@ -1153,7 +1161,7 @@
         </w:r>
         <w:r>
           <w:rPr>
-            <w:rFonts w:ascii="游ゴシック" w:eastAsia="游ゴシック" w:hAnsi="游ゴシック"/>
+            <w:rFonts w:ascii="Yu Gothic" w:eastAsia="Yu Gothic" w:hAnsi="Yu Gothic"/>
             <w:noProof/>
             <w:webHidden/>
           </w:rPr>
@@ -1169,7 +1177,7 @@
           <w:tab w:val="right" w:leader="dot" w:pos="9900"/>
         </w:tabs>
         <w:rPr>
-          <w:rFonts w:ascii="游ゴシック" w:eastAsia="游ゴシック" w:hAnsi="游ゴシック"/>
+          <w:rFonts w:ascii="Yu Gothic" w:eastAsia="Yu Gothic" w:hAnsi="Yu Gothic"/>
           <w:noProof/>
           <w:szCs w:val="22"/>
         </w:rPr>
@@ -1178,14 +1186,14 @@
         <w:r>
           <w:rPr>
             <w:rStyle w:val="a4"/>
-            <w:rFonts w:ascii="游ゴシック" w:eastAsia="游ゴシック" w:hAnsi="游ゴシック" w:cs="Arial"/>
+            <w:rFonts w:ascii="Yu Gothic" w:eastAsia="Yu Gothic" w:hAnsi="Yu Gothic" w:cs="Arial"/>
             <w:noProof/>
           </w:rPr>
           <w:t>1.4</w:t>
         </w:r>
         <w:r>
           <w:rPr>
-            <w:rFonts w:ascii="游ゴシック" w:eastAsia="游ゴシック" w:hAnsi="游ゴシック"/>
+            <w:rFonts w:ascii="Yu Gothic" w:eastAsia="Yu Gothic" w:hAnsi="Yu Gothic"/>
             <w:noProof/>
             <w:szCs w:val="22"/>
           </w:rPr>
@@ -1194,14 +1202,14 @@
         <w:r>
           <w:rPr>
             <w:rStyle w:val="a4"/>
-            <w:rFonts w:ascii="游ゴシック" w:eastAsia="游ゴシック" w:hAnsi="游ゴシック" w:cs="Arial"/>
+            <w:rFonts w:ascii="Yu Gothic" w:eastAsia="Yu Gothic" w:hAnsi="Yu Gothic" w:cs="Arial"/>
             <w:noProof/>
           </w:rPr>
           <w:t>達成基準チェックリストの準備</w:t>
         </w:r>
         <w:r>
           <w:rPr>
-            <w:rFonts w:ascii="游ゴシック" w:eastAsia="游ゴシック" w:hAnsi="游ゴシック"/>
+            <w:rFonts w:ascii="Yu Gothic" w:eastAsia="Yu Gothic" w:hAnsi="Yu Gothic"/>
             <w:noProof/>
             <w:webHidden/>
           </w:rPr>
@@ -1209,7 +1217,7 @@
         </w:r>
         <w:r>
           <w:rPr>
-            <w:rFonts w:ascii="游ゴシック" w:eastAsia="游ゴシック" w:hAnsi="游ゴシック"/>
+            <w:rFonts w:ascii="Yu Gothic" w:eastAsia="Yu Gothic" w:hAnsi="Yu Gothic"/>
             <w:noProof/>
             <w:webHidden/>
           </w:rPr>
@@ -1217,7 +1225,7 @@
         </w:r>
         <w:r>
           <w:rPr>
-            <w:rFonts w:ascii="游ゴシック" w:eastAsia="游ゴシック" w:hAnsi="游ゴシック"/>
+            <w:rFonts w:ascii="Yu Gothic" w:eastAsia="Yu Gothic" w:hAnsi="Yu Gothic"/>
             <w:noProof/>
             <w:webHidden/>
           </w:rPr>
@@ -1225,14 +1233,14 @@
         </w:r>
         <w:r>
           <w:rPr>
-            <w:rFonts w:ascii="游ゴシック" w:eastAsia="游ゴシック" w:hAnsi="游ゴシック"/>
-            <w:noProof/>
-            <w:webHidden/>
-          </w:rPr>
-        </w:r>
-        <w:r>
-          <w:rPr>
-            <w:rFonts w:ascii="游ゴシック" w:eastAsia="游ゴシック" w:hAnsi="游ゴシック"/>
+            <w:rFonts w:ascii="Yu Gothic" w:eastAsia="Yu Gothic" w:hAnsi="Yu Gothic"/>
+            <w:noProof/>
+            <w:webHidden/>
+          </w:rPr>
+        </w:r>
+        <w:r>
+          <w:rPr>
+            <w:rFonts w:ascii="Yu Gothic" w:eastAsia="Yu Gothic" w:hAnsi="Yu Gothic"/>
             <w:noProof/>
             <w:webHidden/>
           </w:rPr>
@@ -1240,7 +1248,7 @@
         </w:r>
         <w:r>
           <w:rPr>
-            <w:rFonts w:ascii="游ゴシック" w:eastAsia="游ゴシック" w:hAnsi="游ゴシック"/>
+            <w:rFonts w:ascii="Yu Gothic" w:eastAsia="Yu Gothic" w:hAnsi="Yu Gothic"/>
             <w:noProof/>
             <w:webHidden/>
           </w:rPr>
@@ -1248,7 +1256,7 @@
         </w:r>
         <w:r>
           <w:rPr>
-            <w:rFonts w:ascii="游ゴシック" w:eastAsia="游ゴシック" w:hAnsi="游ゴシック"/>
+            <w:rFonts w:ascii="Yu Gothic" w:eastAsia="Yu Gothic" w:hAnsi="Yu Gothic"/>
             <w:noProof/>
             <w:webHidden/>
           </w:rPr>
@@ -1263,7 +1271,7 @@
           <w:tab w:val="right" w:leader="dot" w:pos="9900"/>
         </w:tabs>
         <w:rPr>
-          <w:rFonts w:ascii="游ゴシック" w:eastAsia="游ゴシック" w:hAnsi="游ゴシック"/>
+          <w:rFonts w:ascii="Yu Gothic" w:eastAsia="Yu Gothic" w:hAnsi="Yu Gothic"/>
           <w:noProof/>
           <w:szCs w:val="22"/>
         </w:rPr>
@@ -1272,14 +1280,14 @@
         <w:r>
           <w:rPr>
             <w:rStyle w:val="a4"/>
-            <w:rFonts w:ascii="游ゴシック" w:eastAsia="游ゴシック" w:hAnsi="游ゴシック"/>
+            <w:rFonts w:ascii="Yu Gothic" w:eastAsia="Yu Gothic" w:hAnsi="Yu Gothic"/>
             <w:noProof/>
           </w:rPr>
           <w:t xml:space="preserve"> （コラム）miChecker達成基準別活用法</w:t>
         </w:r>
         <w:r>
           <w:rPr>
-            <w:rFonts w:ascii="游ゴシック" w:eastAsia="游ゴシック" w:hAnsi="游ゴシック"/>
+            <w:rFonts w:ascii="Yu Gothic" w:eastAsia="Yu Gothic" w:hAnsi="Yu Gothic"/>
             <w:noProof/>
             <w:webHidden/>
           </w:rPr>
@@ -1287,7 +1295,7 @@
         </w:r>
         <w:r>
           <w:rPr>
-            <w:rFonts w:ascii="游ゴシック" w:eastAsia="游ゴシック" w:hAnsi="游ゴシック"/>
+            <w:rFonts w:ascii="Yu Gothic" w:eastAsia="Yu Gothic" w:hAnsi="Yu Gothic"/>
             <w:noProof/>
             <w:webHidden/>
           </w:rPr>
@@ -1295,7 +1303,7 @@
         </w:r>
         <w:r>
           <w:rPr>
-            <w:rFonts w:ascii="游ゴシック" w:eastAsia="游ゴシック" w:hAnsi="游ゴシック"/>
+            <w:rFonts w:ascii="Yu Gothic" w:eastAsia="Yu Gothic" w:hAnsi="Yu Gothic"/>
             <w:noProof/>
             <w:webHidden/>
           </w:rPr>
@@ -1303,14 +1311,14 @@
         </w:r>
         <w:r>
           <w:rPr>
-            <w:rFonts w:ascii="游ゴシック" w:eastAsia="游ゴシック" w:hAnsi="游ゴシック"/>
-            <w:noProof/>
-            <w:webHidden/>
-          </w:rPr>
-        </w:r>
-        <w:r>
-          <w:rPr>
-            <w:rFonts w:ascii="游ゴシック" w:eastAsia="游ゴシック" w:hAnsi="游ゴシック"/>
+            <w:rFonts w:ascii="Yu Gothic" w:eastAsia="Yu Gothic" w:hAnsi="Yu Gothic"/>
+            <w:noProof/>
+            <w:webHidden/>
+          </w:rPr>
+        </w:r>
+        <w:r>
+          <w:rPr>
+            <w:rFonts w:ascii="Yu Gothic" w:eastAsia="Yu Gothic" w:hAnsi="Yu Gothic"/>
             <w:noProof/>
             <w:webHidden/>
           </w:rPr>
@@ -1318,7 +1326,7 @@
         </w:r>
         <w:r>
           <w:rPr>
-            <w:rFonts w:ascii="游ゴシック" w:eastAsia="游ゴシック" w:hAnsi="游ゴシック"/>
+            <w:rFonts w:ascii="Yu Gothic" w:eastAsia="Yu Gothic" w:hAnsi="Yu Gothic"/>
             <w:noProof/>
             <w:webHidden/>
           </w:rPr>
@@ -1326,7 +1334,7 @@
         </w:r>
         <w:r>
           <w:rPr>
-            <w:rFonts w:ascii="游ゴシック" w:eastAsia="游ゴシック" w:hAnsi="游ゴシック"/>
+            <w:rFonts w:ascii="Yu Gothic" w:eastAsia="Yu Gothic" w:hAnsi="Yu Gothic"/>
             <w:noProof/>
             <w:webHidden/>
           </w:rPr>
@@ -1342,7 +1350,7 @@
           <w:tab w:val="right" w:leader="dot" w:pos="9900"/>
         </w:tabs>
         <w:rPr>
-          <w:rFonts w:ascii="游ゴシック" w:eastAsia="游ゴシック" w:hAnsi="游ゴシック"/>
+          <w:rFonts w:ascii="Yu Gothic" w:eastAsia="Yu Gothic" w:hAnsi="Yu Gothic"/>
           <w:noProof/>
           <w:szCs w:val="22"/>
         </w:rPr>
@@ -1351,14 +1359,14 @@
         <w:r>
           <w:rPr>
             <w:rStyle w:val="a4"/>
-            <w:rFonts w:ascii="游ゴシック" w:eastAsia="游ゴシック" w:hAnsi="游ゴシック" w:cs="Arial"/>
+            <w:rFonts w:ascii="Yu Gothic" w:eastAsia="Yu Gothic" w:hAnsi="Yu Gothic" w:cs="Arial"/>
             <w:noProof/>
           </w:rPr>
           <w:t>1.5</w:t>
         </w:r>
         <w:r>
           <w:rPr>
-            <w:rFonts w:ascii="游ゴシック" w:eastAsia="游ゴシック" w:hAnsi="游ゴシック"/>
+            <w:rFonts w:ascii="Yu Gothic" w:eastAsia="Yu Gothic" w:hAnsi="Yu Gothic"/>
             <w:noProof/>
             <w:szCs w:val="22"/>
           </w:rPr>
@@ -1367,14 +1375,14 @@
         <w:r>
           <w:rPr>
             <w:rStyle w:val="a4"/>
-            <w:rFonts w:ascii="游ゴシック" w:eastAsia="游ゴシック" w:hAnsi="游ゴシック" w:cs="Arial"/>
+            <w:rFonts w:ascii="Yu Gothic" w:eastAsia="Yu Gothic" w:hAnsi="Yu Gothic" w:cs="Arial"/>
             <w:noProof/>
           </w:rPr>
           <w:t>試験対象ページリスト</w:t>
         </w:r>
         <w:r>
           <w:rPr>
-            <w:rFonts w:ascii="游ゴシック" w:eastAsia="游ゴシック" w:hAnsi="游ゴシック"/>
+            <w:rFonts w:ascii="Yu Gothic" w:eastAsia="Yu Gothic" w:hAnsi="Yu Gothic"/>
             <w:noProof/>
             <w:webHidden/>
           </w:rPr>
@@ -1382,7 +1390,7 @@
         </w:r>
         <w:r>
           <w:rPr>
-            <w:rFonts w:ascii="游ゴシック" w:eastAsia="游ゴシック" w:hAnsi="游ゴシック"/>
+            <w:rFonts w:ascii="Yu Gothic" w:eastAsia="Yu Gothic" w:hAnsi="Yu Gothic"/>
             <w:noProof/>
             <w:webHidden/>
           </w:rPr>
@@ -1390,7 +1398,7 @@
         </w:r>
         <w:r>
           <w:rPr>
-            <w:rFonts w:ascii="游ゴシック" w:eastAsia="游ゴシック" w:hAnsi="游ゴシック"/>
+            <w:rFonts w:ascii="Yu Gothic" w:eastAsia="Yu Gothic" w:hAnsi="Yu Gothic"/>
             <w:noProof/>
             <w:webHidden/>
           </w:rPr>
@@ -1398,14 +1406,14 @@
         </w:r>
         <w:r>
           <w:rPr>
-            <w:rFonts w:ascii="游ゴシック" w:eastAsia="游ゴシック" w:hAnsi="游ゴシック"/>
-            <w:noProof/>
-            <w:webHidden/>
-          </w:rPr>
-        </w:r>
-        <w:r>
-          <w:rPr>
-            <w:rFonts w:ascii="游ゴシック" w:eastAsia="游ゴシック" w:hAnsi="游ゴシック"/>
+            <w:rFonts w:ascii="Yu Gothic" w:eastAsia="Yu Gothic" w:hAnsi="Yu Gothic"/>
+            <w:noProof/>
+            <w:webHidden/>
+          </w:rPr>
+        </w:r>
+        <w:r>
+          <w:rPr>
+            <w:rFonts w:ascii="Yu Gothic" w:eastAsia="Yu Gothic" w:hAnsi="Yu Gothic"/>
             <w:noProof/>
             <w:webHidden/>
           </w:rPr>
@@ -1413,7 +1421,7 @@
         </w:r>
         <w:r>
           <w:rPr>
-            <w:rFonts w:ascii="游ゴシック" w:eastAsia="游ゴシック" w:hAnsi="游ゴシック"/>
+            <w:rFonts w:ascii="Yu Gothic" w:eastAsia="Yu Gothic" w:hAnsi="Yu Gothic"/>
             <w:noProof/>
             <w:webHidden/>
           </w:rPr>
@@ -1421,7 +1429,7 @@
         </w:r>
         <w:r>
           <w:rPr>
-            <w:rFonts w:ascii="游ゴシック" w:eastAsia="游ゴシック" w:hAnsi="游ゴシック"/>
+            <w:rFonts w:ascii="Yu Gothic" w:eastAsia="Yu Gothic" w:hAnsi="Yu Gothic"/>
             <w:noProof/>
             <w:webHidden/>
           </w:rPr>
@@ -1433,7 +1441,7 @@
       <w:pPr>
         <w:pStyle w:val="10"/>
         <w:rPr>
-          <w:rFonts w:ascii="游ゴシック" w:eastAsia="游ゴシック" w:hAnsi="游ゴシック"/>
+          <w:rFonts w:ascii="Yu Gothic" w:eastAsia="Yu Gothic" w:hAnsi="Yu Gothic"/>
           <w:noProof/>
           <w:szCs w:val="22"/>
         </w:rPr>
@@ -1442,14 +1450,14 @@
         <w:r>
           <w:rPr>
             <w:rStyle w:val="a4"/>
-            <w:rFonts w:ascii="游ゴシック" w:eastAsia="游ゴシック" w:hAnsi="游ゴシック" w:cs="Arial"/>
+            <w:rFonts w:ascii="Yu Gothic" w:eastAsia="Yu Gothic" w:hAnsi="Yu Gothic" w:cs="Arial"/>
             <w:noProof/>
           </w:rPr>
           <w:t>2.</w:t>
         </w:r>
         <w:r>
           <w:rPr>
-            <w:rFonts w:ascii="游ゴシック" w:eastAsia="游ゴシック" w:hAnsi="游ゴシック"/>
+            <w:rFonts w:ascii="Yu Gothic" w:eastAsia="Yu Gothic" w:hAnsi="Yu Gothic"/>
             <w:noProof/>
             <w:szCs w:val="22"/>
           </w:rPr>
@@ -1458,14 +1466,14 @@
         <w:r>
           <w:rPr>
             <w:rStyle w:val="a4"/>
-            <w:rFonts w:ascii="游ゴシック" w:eastAsia="游ゴシック" w:hAnsi="游ゴシック"/>
+            <w:rFonts w:ascii="Yu Gothic" w:eastAsia="Yu Gothic" w:hAnsi="Yu Gothic"/>
             <w:noProof/>
           </w:rPr>
           <w:t>試験の実施</w:t>
         </w:r>
         <w:r>
           <w:rPr>
-            <w:rFonts w:ascii="游ゴシック" w:eastAsia="游ゴシック" w:hAnsi="游ゴシック"/>
+            <w:rFonts w:ascii="Yu Gothic" w:eastAsia="Yu Gothic" w:hAnsi="Yu Gothic"/>
             <w:noProof/>
             <w:webHidden/>
           </w:rPr>
@@ -1473,7 +1481,7 @@
         </w:r>
         <w:r>
           <w:rPr>
-            <w:rFonts w:ascii="游ゴシック" w:eastAsia="游ゴシック" w:hAnsi="游ゴシック"/>
+            <w:rFonts w:ascii="Yu Gothic" w:eastAsia="Yu Gothic" w:hAnsi="Yu Gothic"/>
             <w:noProof/>
             <w:webHidden/>
           </w:rPr>
@@ -1481,7 +1489,7 @@
         </w:r>
         <w:r>
           <w:rPr>
-            <w:rFonts w:ascii="游ゴシック" w:eastAsia="游ゴシック" w:hAnsi="游ゴシック"/>
+            <w:rFonts w:ascii="Yu Gothic" w:eastAsia="Yu Gothic" w:hAnsi="Yu Gothic"/>
             <w:noProof/>
             <w:webHidden/>
           </w:rPr>
@@ -1489,14 +1497,14 @@
         </w:r>
         <w:r>
           <w:rPr>
-            <w:rFonts w:ascii="游ゴシック" w:eastAsia="游ゴシック" w:hAnsi="游ゴシック"/>
-            <w:noProof/>
-            <w:webHidden/>
-          </w:rPr>
-        </w:r>
-        <w:r>
-          <w:rPr>
-            <w:rFonts w:ascii="游ゴシック" w:eastAsia="游ゴシック" w:hAnsi="游ゴシック"/>
+            <w:rFonts w:ascii="Yu Gothic" w:eastAsia="Yu Gothic" w:hAnsi="Yu Gothic"/>
+            <w:noProof/>
+            <w:webHidden/>
+          </w:rPr>
+        </w:r>
+        <w:r>
+          <w:rPr>
+            <w:rFonts w:ascii="Yu Gothic" w:eastAsia="Yu Gothic" w:hAnsi="Yu Gothic"/>
             <w:noProof/>
             <w:webHidden/>
           </w:rPr>
@@ -1504,7 +1512,7 @@
         </w:r>
         <w:r>
           <w:rPr>
-            <w:rFonts w:ascii="游ゴシック" w:eastAsia="游ゴシック" w:hAnsi="游ゴシック"/>
+            <w:rFonts w:ascii="Yu Gothic" w:eastAsia="Yu Gothic" w:hAnsi="Yu Gothic"/>
             <w:noProof/>
             <w:webHidden/>
           </w:rPr>
@@ -1512,7 +1520,7 @@
         </w:r>
         <w:r>
           <w:rPr>
-            <w:rFonts w:ascii="游ゴシック" w:eastAsia="游ゴシック" w:hAnsi="游ゴシック"/>
+            <w:rFonts w:ascii="Yu Gothic" w:eastAsia="Yu Gothic" w:hAnsi="Yu Gothic"/>
             <w:noProof/>
             <w:webHidden/>
           </w:rPr>
@@ -1527,7 +1535,7 @@
           <w:tab w:val="right" w:leader="dot" w:pos="9900"/>
         </w:tabs>
         <w:rPr>
-          <w:rFonts w:ascii="游ゴシック" w:eastAsia="游ゴシック" w:hAnsi="游ゴシック"/>
+          <w:rFonts w:ascii="Yu Gothic" w:eastAsia="Yu Gothic" w:hAnsi="Yu Gothic"/>
           <w:noProof/>
           <w:szCs w:val="22"/>
         </w:rPr>
@@ -1536,7 +1544,7 @@
         <w:r>
           <w:rPr>
             <w:rStyle w:val="a4"/>
-            <w:rFonts w:ascii="游ゴシック" w:eastAsia="游ゴシック" w:hAnsi="游ゴシック" w:cs="Arial"/>
+            <w:rFonts w:ascii="Yu Gothic" w:eastAsia="Yu Gothic" w:hAnsi="Yu Gothic" w:cs="Arial"/>
             <w:i/>
             <w:noProof/>
           </w:rPr>
@@ -1545,14 +1553,14 @@
         <w:r>
           <w:rPr>
             <w:rStyle w:val="a4"/>
-            <w:rFonts w:ascii="游ゴシック" w:eastAsia="游ゴシック" w:hAnsi="游ゴシック" w:cs="Arial"/>
+            <w:rFonts w:ascii="Yu Gothic" w:eastAsia="Yu Gothic" w:hAnsi="Yu Gothic" w:cs="Arial"/>
             <w:noProof/>
           </w:rPr>
           <w:t xml:space="preserve">　miCheckerによる試験の実施</w:t>
         </w:r>
         <w:r>
           <w:rPr>
-            <w:rFonts w:ascii="游ゴシック" w:eastAsia="游ゴシック" w:hAnsi="游ゴシック"/>
+            <w:rFonts w:ascii="Yu Gothic" w:eastAsia="Yu Gothic" w:hAnsi="Yu Gothic"/>
             <w:noProof/>
             <w:webHidden/>
           </w:rPr>
@@ -1560,7 +1568,7 @@
         </w:r>
         <w:r>
           <w:rPr>
-            <w:rFonts w:ascii="游ゴシック" w:eastAsia="游ゴシック" w:hAnsi="游ゴシック"/>
+            <w:rFonts w:ascii="Yu Gothic" w:eastAsia="Yu Gothic" w:hAnsi="Yu Gothic"/>
             <w:noProof/>
             <w:webHidden/>
           </w:rPr>
@@ -1568,7 +1576,7 @@
         </w:r>
         <w:r>
           <w:rPr>
-            <w:rFonts w:ascii="游ゴシック" w:eastAsia="游ゴシック" w:hAnsi="游ゴシック"/>
+            <w:rFonts w:ascii="Yu Gothic" w:eastAsia="Yu Gothic" w:hAnsi="Yu Gothic"/>
             <w:noProof/>
             <w:webHidden/>
           </w:rPr>
@@ -1576,14 +1584,14 @@
         </w:r>
         <w:r>
           <w:rPr>
-            <w:rFonts w:ascii="游ゴシック" w:eastAsia="游ゴシック" w:hAnsi="游ゴシック"/>
-            <w:noProof/>
-            <w:webHidden/>
-          </w:rPr>
-        </w:r>
-        <w:r>
-          <w:rPr>
-            <w:rFonts w:ascii="游ゴシック" w:eastAsia="游ゴシック" w:hAnsi="游ゴシック"/>
+            <w:rFonts w:ascii="Yu Gothic" w:eastAsia="Yu Gothic" w:hAnsi="Yu Gothic"/>
+            <w:noProof/>
+            <w:webHidden/>
+          </w:rPr>
+        </w:r>
+        <w:r>
+          <w:rPr>
+            <w:rFonts w:ascii="Yu Gothic" w:eastAsia="Yu Gothic" w:hAnsi="Yu Gothic"/>
             <w:noProof/>
             <w:webHidden/>
           </w:rPr>
@@ -1591,7 +1599,7 @@
         </w:r>
         <w:r>
           <w:rPr>
-            <w:rFonts w:ascii="游ゴシック" w:eastAsia="游ゴシック" w:hAnsi="游ゴシック"/>
+            <w:rFonts w:ascii="Yu Gothic" w:eastAsia="Yu Gothic" w:hAnsi="Yu Gothic"/>
             <w:noProof/>
             <w:webHidden/>
           </w:rPr>
@@ -1599,7 +1607,7 @@
         </w:r>
         <w:r>
           <w:rPr>
-            <w:rFonts w:ascii="游ゴシック" w:eastAsia="游ゴシック" w:hAnsi="游ゴシック"/>
+            <w:rFonts w:ascii="Yu Gothic" w:eastAsia="Yu Gothic" w:hAnsi="Yu Gothic"/>
             <w:noProof/>
             <w:webHidden/>
           </w:rPr>
@@ -1614,7 +1622,7 @@
           <w:tab w:val="right" w:leader="dot" w:pos="9900"/>
         </w:tabs>
         <w:rPr>
-          <w:rFonts w:ascii="游ゴシック" w:eastAsia="游ゴシック" w:hAnsi="游ゴシック"/>
+          <w:rFonts w:ascii="Yu Gothic" w:eastAsia="Yu Gothic" w:hAnsi="Yu Gothic"/>
           <w:noProof/>
           <w:szCs w:val="22"/>
         </w:rPr>
@@ -1623,7 +1631,7 @@
         <w:r>
           <w:rPr>
             <w:rStyle w:val="a4"/>
-            <w:rFonts w:ascii="游ゴシック" w:eastAsia="游ゴシック" w:hAnsi="游ゴシック" w:cs="Arial"/>
+            <w:rFonts w:ascii="Yu Gothic" w:eastAsia="Yu Gothic" w:hAnsi="Yu Gothic" w:cs="Arial"/>
             <w:i/>
             <w:noProof/>
           </w:rPr>
@@ -1632,14 +1640,14 @@
         <w:r>
           <w:rPr>
             <w:rStyle w:val="a4"/>
-            <w:rFonts w:ascii="游ゴシック" w:eastAsia="游ゴシック" w:hAnsi="游ゴシック" w:cs="Arial"/>
+            <w:rFonts w:ascii="Yu Gothic" w:eastAsia="Yu Gothic" w:hAnsi="Yu Gothic" w:cs="Arial"/>
             <w:noProof/>
           </w:rPr>
           <w:t>問題あり : ツールによって問題と判定された項目の検証</w:t>
         </w:r>
         <w:r>
           <w:rPr>
-            <w:rFonts w:ascii="游ゴシック" w:eastAsia="游ゴシック" w:hAnsi="游ゴシック"/>
+            <w:rFonts w:ascii="Yu Gothic" w:eastAsia="Yu Gothic" w:hAnsi="Yu Gothic"/>
             <w:noProof/>
             <w:webHidden/>
           </w:rPr>
@@ -1647,7 +1655,7 @@
         </w:r>
         <w:r>
           <w:rPr>
-            <w:rFonts w:ascii="游ゴシック" w:eastAsia="游ゴシック" w:hAnsi="游ゴシック"/>
+            <w:rFonts w:ascii="Yu Gothic" w:eastAsia="Yu Gothic" w:hAnsi="Yu Gothic"/>
             <w:noProof/>
             <w:webHidden/>
           </w:rPr>
@@ -1655,7 +1663,7 @@
         </w:r>
         <w:r>
           <w:rPr>
-            <w:rFonts w:ascii="游ゴシック" w:eastAsia="游ゴシック" w:hAnsi="游ゴシック"/>
+            <w:rFonts w:ascii="Yu Gothic" w:eastAsia="Yu Gothic" w:hAnsi="Yu Gothic"/>
             <w:noProof/>
             <w:webHidden/>
           </w:rPr>
@@ -1663,14 +1671,14 @@
         </w:r>
         <w:r>
           <w:rPr>
-            <w:rFonts w:ascii="游ゴシック" w:eastAsia="游ゴシック" w:hAnsi="游ゴシック"/>
-            <w:noProof/>
-            <w:webHidden/>
-          </w:rPr>
-        </w:r>
-        <w:r>
-          <w:rPr>
-            <w:rFonts w:ascii="游ゴシック" w:eastAsia="游ゴシック" w:hAnsi="游ゴシック"/>
+            <w:rFonts w:ascii="Yu Gothic" w:eastAsia="Yu Gothic" w:hAnsi="Yu Gothic"/>
+            <w:noProof/>
+            <w:webHidden/>
+          </w:rPr>
+        </w:r>
+        <w:r>
+          <w:rPr>
+            <w:rFonts w:ascii="Yu Gothic" w:eastAsia="Yu Gothic" w:hAnsi="Yu Gothic"/>
             <w:noProof/>
             <w:webHidden/>
           </w:rPr>
@@ -1678,7 +1686,7 @@
         </w:r>
         <w:r>
           <w:rPr>
-            <w:rFonts w:ascii="游ゴシック" w:eastAsia="游ゴシック" w:hAnsi="游ゴシック"/>
+            <w:rFonts w:ascii="Yu Gothic" w:eastAsia="Yu Gothic" w:hAnsi="Yu Gothic"/>
             <w:noProof/>
             <w:webHidden/>
           </w:rPr>
@@ -1686,7 +1694,7 @@
         </w:r>
         <w:r>
           <w:rPr>
-            <w:rFonts w:ascii="游ゴシック" w:eastAsia="游ゴシック" w:hAnsi="游ゴシック"/>
+            <w:rFonts w:ascii="Yu Gothic" w:eastAsia="Yu Gothic" w:hAnsi="Yu Gothic"/>
             <w:noProof/>
             <w:webHidden/>
           </w:rPr>
@@ -1701,7 +1709,7 @@
           <w:tab w:val="right" w:leader="dot" w:pos="9900"/>
         </w:tabs>
         <w:rPr>
-          <w:rFonts w:ascii="游ゴシック" w:eastAsia="游ゴシック" w:hAnsi="游ゴシック"/>
+          <w:rFonts w:ascii="Yu Gothic" w:eastAsia="Yu Gothic" w:hAnsi="Yu Gothic"/>
           <w:noProof/>
           <w:szCs w:val="22"/>
         </w:rPr>
@@ -1710,7 +1718,7 @@
         <w:r>
           <w:rPr>
             <w:rStyle w:val="a4"/>
-            <w:rFonts w:ascii="游ゴシック" w:eastAsia="游ゴシック" w:hAnsi="游ゴシック" w:cs="Arial"/>
+            <w:rFonts w:ascii="Yu Gothic" w:eastAsia="Yu Gothic" w:hAnsi="Yu Gothic" w:cs="Arial"/>
             <w:i/>
             <w:noProof/>
           </w:rPr>
@@ -1719,14 +1727,14 @@
         <w:r>
           <w:rPr>
             <w:rStyle w:val="a4"/>
-            <w:rFonts w:ascii="游ゴシック" w:eastAsia="游ゴシック" w:hAnsi="游ゴシック" w:cs="Arial"/>
+            <w:rFonts w:ascii="Yu Gothic" w:eastAsia="Yu Gothic" w:hAnsi="Yu Gothic" w:cs="Arial"/>
             <w:noProof/>
           </w:rPr>
           <w:t>問題の可能性大 : ツールによって問題の可能性が高いと判定された項目の検証</w:t>
         </w:r>
         <w:r>
           <w:rPr>
-            <w:rFonts w:ascii="游ゴシック" w:eastAsia="游ゴシック" w:hAnsi="游ゴシック"/>
+            <w:rFonts w:ascii="Yu Gothic" w:eastAsia="Yu Gothic" w:hAnsi="Yu Gothic"/>
             <w:noProof/>
             <w:webHidden/>
           </w:rPr>
@@ -1734,7 +1742,7 @@
         </w:r>
         <w:r>
           <w:rPr>
-            <w:rFonts w:ascii="游ゴシック" w:eastAsia="游ゴシック" w:hAnsi="游ゴシック"/>
+            <w:rFonts w:ascii="Yu Gothic" w:eastAsia="Yu Gothic" w:hAnsi="Yu Gothic"/>
             <w:noProof/>
             <w:webHidden/>
           </w:rPr>
@@ -1742,7 +1750,7 @@
         </w:r>
         <w:r>
           <w:rPr>
-            <w:rFonts w:ascii="游ゴシック" w:eastAsia="游ゴシック" w:hAnsi="游ゴシック"/>
+            <w:rFonts w:ascii="Yu Gothic" w:eastAsia="Yu Gothic" w:hAnsi="Yu Gothic"/>
             <w:noProof/>
             <w:webHidden/>
           </w:rPr>
@@ -1750,14 +1758,14 @@
         </w:r>
         <w:r>
           <w:rPr>
-            <w:rFonts w:ascii="游ゴシック" w:eastAsia="游ゴシック" w:hAnsi="游ゴシック"/>
-            <w:noProof/>
-            <w:webHidden/>
-          </w:rPr>
-        </w:r>
-        <w:r>
-          <w:rPr>
-            <w:rFonts w:ascii="游ゴシック" w:eastAsia="游ゴシック" w:hAnsi="游ゴシック"/>
+            <w:rFonts w:ascii="Yu Gothic" w:eastAsia="Yu Gothic" w:hAnsi="Yu Gothic"/>
+            <w:noProof/>
+            <w:webHidden/>
+          </w:rPr>
+        </w:r>
+        <w:r>
+          <w:rPr>
+            <w:rFonts w:ascii="Yu Gothic" w:eastAsia="Yu Gothic" w:hAnsi="Yu Gothic"/>
             <w:noProof/>
             <w:webHidden/>
           </w:rPr>
@@ -1765,7 +1773,7 @@
         </w:r>
         <w:r>
           <w:rPr>
-            <w:rFonts w:ascii="游ゴシック" w:eastAsia="游ゴシック" w:hAnsi="游ゴシック"/>
+            <w:rFonts w:ascii="Yu Gothic" w:eastAsia="Yu Gothic" w:hAnsi="Yu Gothic"/>
             <w:noProof/>
             <w:webHidden/>
           </w:rPr>
@@ -1773,7 +1781,7 @@
         </w:r>
         <w:r>
           <w:rPr>
-            <w:rFonts w:ascii="游ゴシック" w:eastAsia="游ゴシック" w:hAnsi="游ゴシック"/>
+            <w:rFonts w:ascii="Yu Gothic" w:eastAsia="Yu Gothic" w:hAnsi="Yu Gothic"/>
             <w:noProof/>
             <w:webHidden/>
           </w:rPr>
@@ -1788,7 +1796,7 @@
           <w:tab w:val="right" w:leader="dot" w:pos="9900"/>
         </w:tabs>
         <w:rPr>
-          <w:rFonts w:ascii="游ゴシック" w:eastAsia="游ゴシック" w:hAnsi="游ゴシック"/>
+          <w:rFonts w:ascii="Yu Gothic" w:eastAsia="Yu Gothic" w:hAnsi="Yu Gothic"/>
           <w:noProof/>
           <w:szCs w:val="22"/>
         </w:rPr>
@@ -1797,7 +1805,7 @@
         <w:r>
           <w:rPr>
             <w:rStyle w:val="a4"/>
-            <w:rFonts w:ascii="游ゴシック" w:eastAsia="游ゴシック" w:hAnsi="游ゴシック" w:cs="Arial"/>
+            <w:rFonts w:ascii="Yu Gothic" w:eastAsia="Yu Gothic" w:hAnsi="Yu Gothic" w:cs="Arial"/>
             <w:i/>
             <w:noProof/>
           </w:rPr>
@@ -1806,14 +1814,14 @@
         <w:r>
           <w:rPr>
             <w:rStyle w:val="a4"/>
-            <w:rFonts w:ascii="游ゴシック" w:eastAsia="游ゴシック" w:hAnsi="游ゴシック" w:cs="Arial"/>
+            <w:rFonts w:ascii="Yu Gothic" w:eastAsia="Yu Gothic" w:hAnsi="Yu Gothic" w:cs="Arial"/>
             <w:noProof/>
           </w:rPr>
           <w:t>要判断箇所 : 問題があるかどうかを判断するべき箇所の検証</w:t>
         </w:r>
         <w:r>
           <w:rPr>
-            <w:rFonts w:ascii="游ゴシック" w:eastAsia="游ゴシック" w:hAnsi="游ゴシック"/>
+            <w:rFonts w:ascii="Yu Gothic" w:eastAsia="Yu Gothic" w:hAnsi="Yu Gothic"/>
             <w:noProof/>
             <w:webHidden/>
           </w:rPr>
@@ -1821,7 +1829,7 @@
         </w:r>
         <w:r>
           <w:rPr>
-            <w:rFonts w:ascii="游ゴシック" w:eastAsia="游ゴシック" w:hAnsi="游ゴシック"/>
+            <w:rFonts w:ascii="Yu Gothic" w:eastAsia="Yu Gothic" w:hAnsi="Yu Gothic"/>
             <w:noProof/>
             <w:webHidden/>
           </w:rPr>
@@ -1829,7 +1837,7 @@
         </w:r>
         <w:r>
           <w:rPr>
-            <w:rFonts w:ascii="游ゴシック" w:eastAsia="游ゴシック" w:hAnsi="游ゴシック"/>
+            <w:rFonts w:ascii="Yu Gothic" w:eastAsia="Yu Gothic" w:hAnsi="Yu Gothic"/>
             <w:noProof/>
             <w:webHidden/>
           </w:rPr>
@@ -1837,14 +1845,14 @@
         </w:r>
         <w:r>
           <w:rPr>
-            <w:rFonts w:ascii="游ゴシック" w:eastAsia="游ゴシック" w:hAnsi="游ゴシック"/>
-            <w:noProof/>
-            <w:webHidden/>
-          </w:rPr>
-        </w:r>
-        <w:r>
-          <w:rPr>
-            <w:rFonts w:ascii="游ゴシック" w:eastAsia="游ゴシック" w:hAnsi="游ゴシック"/>
+            <w:rFonts w:ascii="Yu Gothic" w:eastAsia="Yu Gothic" w:hAnsi="Yu Gothic"/>
+            <w:noProof/>
+            <w:webHidden/>
+          </w:rPr>
+        </w:r>
+        <w:r>
+          <w:rPr>
+            <w:rFonts w:ascii="Yu Gothic" w:eastAsia="Yu Gothic" w:hAnsi="Yu Gothic"/>
             <w:noProof/>
             <w:webHidden/>
           </w:rPr>
@@ -1852,7 +1860,7 @@
         </w:r>
         <w:r>
           <w:rPr>
-            <w:rFonts w:ascii="游ゴシック" w:eastAsia="游ゴシック" w:hAnsi="游ゴシック"/>
+            <w:rFonts w:ascii="Yu Gothic" w:eastAsia="Yu Gothic" w:hAnsi="Yu Gothic"/>
             <w:noProof/>
             <w:webHidden/>
           </w:rPr>
@@ -1860,7 +1868,7 @@
         </w:r>
         <w:r>
           <w:rPr>
-            <w:rFonts w:ascii="游ゴシック" w:eastAsia="游ゴシック" w:hAnsi="游ゴシック"/>
+            <w:rFonts w:ascii="Yu Gothic" w:eastAsia="Yu Gothic" w:hAnsi="Yu Gothic"/>
             <w:noProof/>
             <w:webHidden/>
           </w:rPr>
@@ -1875,7 +1883,7 @@
           <w:tab w:val="right" w:leader="dot" w:pos="9900"/>
         </w:tabs>
         <w:rPr>
-          <w:rFonts w:ascii="游ゴシック" w:eastAsia="游ゴシック" w:hAnsi="游ゴシック"/>
+          <w:rFonts w:ascii="Yu Gothic" w:eastAsia="Yu Gothic" w:hAnsi="Yu Gothic"/>
           <w:noProof/>
           <w:szCs w:val="22"/>
         </w:rPr>
@@ -1884,7 +1892,7 @@
         <w:r>
           <w:rPr>
             <w:rStyle w:val="a4"/>
-            <w:rFonts w:ascii="游ゴシック" w:eastAsia="游ゴシック" w:hAnsi="游ゴシック" w:cs="Arial"/>
+            <w:rFonts w:ascii="Yu Gothic" w:eastAsia="Yu Gothic" w:hAnsi="Yu Gothic" w:cs="Arial"/>
             <w:i/>
             <w:noProof/>
           </w:rPr>
@@ -1893,14 +1901,14 @@
         <w:r>
           <w:rPr>
             <w:rStyle w:val="a4"/>
-            <w:rFonts w:ascii="游ゴシック" w:eastAsia="游ゴシック" w:hAnsi="游ゴシック" w:cs="Arial"/>
+            <w:rFonts w:ascii="Yu Gothic" w:eastAsia="Yu Gothic" w:hAnsi="Yu Gothic" w:cs="Arial"/>
             <w:noProof/>
           </w:rPr>
           <w:t>手動確認 : 問題の可能性のある箇所を探して検証</w:t>
         </w:r>
         <w:r>
           <w:rPr>
-            <w:rFonts w:ascii="游ゴシック" w:eastAsia="游ゴシック" w:hAnsi="游ゴシック"/>
+            <w:rFonts w:ascii="Yu Gothic" w:eastAsia="Yu Gothic" w:hAnsi="Yu Gothic"/>
             <w:noProof/>
             <w:webHidden/>
           </w:rPr>
@@ -1908,7 +1916,7 @@
         </w:r>
         <w:r>
           <w:rPr>
-            <w:rFonts w:ascii="游ゴシック" w:eastAsia="游ゴシック" w:hAnsi="游ゴシック"/>
+            <w:rFonts w:ascii="Yu Gothic" w:eastAsia="Yu Gothic" w:hAnsi="Yu Gothic"/>
             <w:noProof/>
             <w:webHidden/>
           </w:rPr>
@@ -1916,7 +1924,7 @@
         </w:r>
         <w:r>
           <w:rPr>
-            <w:rFonts w:ascii="游ゴシック" w:eastAsia="游ゴシック" w:hAnsi="游ゴシック"/>
+            <w:rFonts w:ascii="Yu Gothic" w:eastAsia="Yu Gothic" w:hAnsi="Yu Gothic"/>
             <w:noProof/>
             <w:webHidden/>
           </w:rPr>
@@ -1924,14 +1932,14 @@
         </w:r>
         <w:r>
           <w:rPr>
-            <w:rFonts w:ascii="游ゴシック" w:eastAsia="游ゴシック" w:hAnsi="游ゴシック"/>
-            <w:noProof/>
-            <w:webHidden/>
-          </w:rPr>
-        </w:r>
-        <w:r>
-          <w:rPr>
-            <w:rFonts w:ascii="游ゴシック" w:eastAsia="游ゴシック" w:hAnsi="游ゴシック"/>
+            <w:rFonts w:ascii="Yu Gothic" w:eastAsia="Yu Gothic" w:hAnsi="Yu Gothic"/>
+            <w:noProof/>
+            <w:webHidden/>
+          </w:rPr>
+        </w:r>
+        <w:r>
+          <w:rPr>
+            <w:rFonts w:ascii="Yu Gothic" w:eastAsia="Yu Gothic" w:hAnsi="Yu Gothic"/>
             <w:noProof/>
             <w:webHidden/>
           </w:rPr>
@@ -1939,7 +1947,7 @@
         </w:r>
         <w:r>
           <w:rPr>
-            <w:rFonts w:ascii="游ゴシック" w:eastAsia="游ゴシック" w:hAnsi="游ゴシック"/>
+            <w:rFonts w:ascii="Yu Gothic" w:eastAsia="Yu Gothic" w:hAnsi="Yu Gothic"/>
             <w:noProof/>
             <w:webHidden/>
           </w:rPr>
@@ -1947,7 +1955,7 @@
         </w:r>
         <w:r>
           <w:rPr>
-            <w:rFonts w:ascii="游ゴシック" w:eastAsia="游ゴシック" w:hAnsi="游ゴシック"/>
+            <w:rFonts w:ascii="Yu Gothic" w:eastAsia="Yu Gothic" w:hAnsi="Yu Gothic"/>
             <w:noProof/>
             <w:webHidden/>
           </w:rPr>
@@ -1962,7 +1970,7 @@
           <w:tab w:val="right" w:leader="dot" w:pos="9900"/>
         </w:tabs>
         <w:rPr>
-          <w:rFonts w:ascii="游ゴシック" w:eastAsia="游ゴシック" w:hAnsi="游ゴシック"/>
+          <w:rFonts w:ascii="Yu Gothic" w:eastAsia="Yu Gothic" w:hAnsi="Yu Gothic"/>
           <w:noProof/>
           <w:szCs w:val="22"/>
         </w:rPr>
@@ -1971,7 +1979,7 @@
         <w:r>
           <w:rPr>
             <w:rStyle w:val="a4"/>
-            <w:rFonts w:ascii="游ゴシック" w:eastAsia="游ゴシック" w:hAnsi="游ゴシック" w:cs="Arial"/>
+            <w:rFonts w:ascii="Yu Gothic" w:eastAsia="Yu Gothic" w:hAnsi="Yu Gothic" w:cs="Arial"/>
             <w:i/>
             <w:noProof/>
           </w:rPr>
@@ -1980,14 +1988,14 @@
         <w:r>
           <w:rPr>
             <w:rStyle w:val="a4"/>
-            <w:rFonts w:ascii="游ゴシック" w:eastAsia="游ゴシック" w:hAnsi="游ゴシック" w:cs="Arial"/>
+            <w:rFonts w:ascii="Yu Gothic" w:eastAsia="Yu Gothic" w:hAnsi="Yu Gothic" w:cs="Arial"/>
             <w:noProof/>
           </w:rPr>
           <w:t>何も報告されない場合： いずれの報告も無い場合の対応</w:t>
         </w:r>
         <w:r>
           <w:rPr>
-            <w:rFonts w:ascii="游ゴシック" w:eastAsia="游ゴシック" w:hAnsi="游ゴシック"/>
+            <w:rFonts w:ascii="Yu Gothic" w:eastAsia="Yu Gothic" w:hAnsi="Yu Gothic"/>
             <w:noProof/>
             <w:webHidden/>
           </w:rPr>
@@ -1995,7 +2003,7 @@
         </w:r>
         <w:r>
           <w:rPr>
-            <w:rFonts w:ascii="游ゴシック" w:eastAsia="游ゴシック" w:hAnsi="游ゴシック"/>
+            <w:rFonts w:ascii="Yu Gothic" w:eastAsia="Yu Gothic" w:hAnsi="Yu Gothic"/>
             <w:noProof/>
             <w:webHidden/>
           </w:rPr>
@@ -2003,7 +2011,7 @@
         </w:r>
         <w:r>
           <w:rPr>
-            <w:rFonts w:ascii="游ゴシック" w:eastAsia="游ゴシック" w:hAnsi="游ゴシック"/>
+            <w:rFonts w:ascii="Yu Gothic" w:eastAsia="Yu Gothic" w:hAnsi="Yu Gothic"/>
             <w:noProof/>
             <w:webHidden/>
           </w:rPr>
@@ -2011,14 +2019,14 @@
         </w:r>
         <w:r>
           <w:rPr>
-            <w:rFonts w:ascii="游ゴシック" w:eastAsia="游ゴシック" w:hAnsi="游ゴシック"/>
-            <w:noProof/>
-            <w:webHidden/>
-          </w:rPr>
-        </w:r>
-        <w:r>
-          <w:rPr>
-            <w:rFonts w:ascii="游ゴシック" w:eastAsia="游ゴシック" w:hAnsi="游ゴシック"/>
+            <w:rFonts w:ascii="Yu Gothic" w:eastAsia="Yu Gothic" w:hAnsi="Yu Gothic"/>
+            <w:noProof/>
+            <w:webHidden/>
+          </w:rPr>
+        </w:r>
+        <w:r>
+          <w:rPr>
+            <w:rFonts w:ascii="Yu Gothic" w:eastAsia="Yu Gothic" w:hAnsi="Yu Gothic"/>
             <w:noProof/>
             <w:webHidden/>
           </w:rPr>
@@ -2026,7 +2034,7 @@
         </w:r>
         <w:r>
           <w:rPr>
-            <w:rFonts w:ascii="游ゴシック" w:eastAsia="游ゴシック" w:hAnsi="游ゴシック"/>
+            <w:rFonts w:ascii="Yu Gothic" w:eastAsia="Yu Gothic" w:hAnsi="Yu Gothic"/>
             <w:noProof/>
             <w:webHidden/>
           </w:rPr>
@@ -2034,7 +2042,7 @@
         </w:r>
         <w:r>
           <w:rPr>
-            <w:rFonts w:ascii="游ゴシック" w:eastAsia="游ゴシック" w:hAnsi="游ゴシック"/>
+            <w:rFonts w:ascii="Yu Gothic" w:eastAsia="Yu Gothic" w:hAnsi="Yu Gothic"/>
             <w:noProof/>
             <w:webHidden/>
           </w:rPr>
@@ -2049,7 +2057,7 @@
           <w:tab w:val="right" w:leader="dot" w:pos="9900"/>
         </w:tabs>
         <w:rPr>
-          <w:rFonts w:ascii="游ゴシック" w:eastAsia="游ゴシック" w:hAnsi="游ゴシック"/>
+          <w:rFonts w:ascii="Yu Gothic" w:eastAsia="Yu Gothic" w:hAnsi="Yu Gothic"/>
           <w:noProof/>
           <w:szCs w:val="22"/>
         </w:rPr>
@@ -2058,7 +2066,7 @@
         <w:r>
           <w:rPr>
             <w:rStyle w:val="a4"/>
-            <w:rFonts w:ascii="游ゴシック" w:eastAsia="游ゴシック" w:hAnsi="游ゴシック" w:cs="Arial"/>
+            <w:rFonts w:ascii="Yu Gothic" w:eastAsia="Yu Gothic" w:hAnsi="Yu Gothic" w:cs="Arial"/>
             <w:i/>
             <w:noProof/>
           </w:rPr>
@@ -2067,14 +2075,14 @@
         <w:r>
           <w:rPr>
             <w:rStyle w:val="a4"/>
-            <w:rFonts w:ascii="游ゴシック" w:eastAsia="游ゴシック" w:hAnsi="游ゴシック" w:cs="Arial"/>
+            <w:rFonts w:ascii="Yu Gothic" w:eastAsia="Yu Gothic" w:hAnsi="Yu Gothic" w:cs="Arial"/>
             <w:noProof/>
           </w:rPr>
           <w:t xml:space="preserve">　各達成基準の合否判定</w:t>
         </w:r>
         <w:r>
           <w:rPr>
-            <w:rFonts w:ascii="游ゴシック" w:eastAsia="游ゴシック" w:hAnsi="游ゴシック"/>
+            <w:rFonts w:ascii="Yu Gothic" w:eastAsia="Yu Gothic" w:hAnsi="Yu Gothic"/>
             <w:noProof/>
             <w:webHidden/>
           </w:rPr>
@@ -2082,7 +2090,7 @@
         </w:r>
         <w:r>
           <w:rPr>
-            <w:rFonts w:ascii="游ゴシック" w:eastAsia="游ゴシック" w:hAnsi="游ゴシック"/>
+            <w:rFonts w:ascii="Yu Gothic" w:eastAsia="Yu Gothic" w:hAnsi="Yu Gothic"/>
             <w:noProof/>
             <w:webHidden/>
           </w:rPr>
@@ -2090,7 +2098,7 @@
         </w:r>
         <w:r>
           <w:rPr>
-            <w:rFonts w:ascii="游ゴシック" w:eastAsia="游ゴシック" w:hAnsi="游ゴシック"/>
+            <w:rFonts w:ascii="Yu Gothic" w:eastAsia="Yu Gothic" w:hAnsi="Yu Gothic"/>
             <w:noProof/>
             <w:webHidden/>
           </w:rPr>
@@ -2098,14 +2106,14 @@
         </w:r>
         <w:r>
           <w:rPr>
-            <w:rFonts w:ascii="游ゴシック" w:eastAsia="游ゴシック" w:hAnsi="游ゴシック"/>
-            <w:noProof/>
-            <w:webHidden/>
-          </w:rPr>
-        </w:r>
-        <w:r>
-          <w:rPr>
-            <w:rFonts w:ascii="游ゴシック" w:eastAsia="游ゴシック" w:hAnsi="游ゴシック"/>
+            <w:rFonts w:ascii="Yu Gothic" w:eastAsia="Yu Gothic" w:hAnsi="Yu Gothic"/>
+            <w:noProof/>
+            <w:webHidden/>
+          </w:rPr>
+        </w:r>
+        <w:r>
+          <w:rPr>
+            <w:rFonts w:ascii="Yu Gothic" w:eastAsia="Yu Gothic" w:hAnsi="Yu Gothic"/>
             <w:noProof/>
             <w:webHidden/>
           </w:rPr>
@@ -2113,7 +2121,7 @@
         </w:r>
         <w:r>
           <w:rPr>
-            <w:rFonts w:ascii="游ゴシック" w:eastAsia="游ゴシック" w:hAnsi="游ゴシック"/>
+            <w:rFonts w:ascii="Yu Gothic" w:eastAsia="Yu Gothic" w:hAnsi="Yu Gothic"/>
             <w:noProof/>
             <w:webHidden/>
           </w:rPr>
@@ -2121,7 +2129,7 @@
         </w:r>
         <w:r>
           <w:rPr>
-            <w:rFonts w:ascii="游ゴシック" w:eastAsia="游ゴシック" w:hAnsi="游ゴシック"/>
+            <w:rFonts w:ascii="Yu Gothic" w:eastAsia="Yu Gothic" w:hAnsi="Yu Gothic"/>
             <w:noProof/>
             <w:webHidden/>
           </w:rPr>
@@ -2136,7 +2144,7 @@
           <w:tab w:val="right" w:leader="dot" w:pos="9900"/>
         </w:tabs>
         <w:rPr>
-          <w:rFonts w:ascii="游ゴシック" w:eastAsia="游ゴシック" w:hAnsi="游ゴシック"/>
+          <w:rFonts w:ascii="Yu Gothic" w:eastAsia="Yu Gothic" w:hAnsi="Yu Gothic"/>
           <w:noProof/>
           <w:szCs w:val="22"/>
         </w:rPr>
@@ -2145,7 +2153,7 @@
         <w:r>
           <w:rPr>
             <w:rStyle w:val="a4"/>
-            <w:rFonts w:ascii="游ゴシック" w:eastAsia="游ゴシック" w:hAnsi="游ゴシック" w:cs="Arial"/>
+            <w:rFonts w:ascii="Yu Gothic" w:eastAsia="Yu Gothic" w:hAnsi="Yu Gothic" w:cs="Arial"/>
             <w:i/>
             <w:noProof/>
           </w:rPr>
@@ -2154,14 +2162,14 @@
         <w:r>
           <w:rPr>
             <w:rStyle w:val="a4"/>
-            <w:rFonts w:ascii="游ゴシック" w:eastAsia="游ゴシック" w:hAnsi="游ゴシック" w:cs="Arial"/>
+            <w:rFonts w:ascii="Yu Gothic" w:eastAsia="Yu Gothic" w:hAnsi="Yu Gothic" w:cs="Arial"/>
             <w:noProof/>
           </w:rPr>
           <w:t xml:space="preserve"> 　 達成基準チェックリストの作成</w:t>
         </w:r>
         <w:r>
           <w:rPr>
-            <w:rFonts w:ascii="游ゴシック" w:eastAsia="游ゴシック" w:hAnsi="游ゴシック"/>
+            <w:rFonts w:ascii="Yu Gothic" w:eastAsia="Yu Gothic" w:hAnsi="Yu Gothic"/>
             <w:noProof/>
             <w:webHidden/>
           </w:rPr>
@@ -2169,7 +2177,7 @@
         </w:r>
         <w:r>
           <w:rPr>
-            <w:rFonts w:ascii="游ゴシック" w:eastAsia="游ゴシック" w:hAnsi="游ゴシック"/>
+            <w:rFonts w:ascii="Yu Gothic" w:eastAsia="Yu Gothic" w:hAnsi="Yu Gothic"/>
             <w:noProof/>
             <w:webHidden/>
           </w:rPr>
@@ -2177,7 +2185,7 @@
         </w:r>
         <w:r>
           <w:rPr>
-            <w:rFonts w:ascii="游ゴシック" w:eastAsia="游ゴシック" w:hAnsi="游ゴシック"/>
+            <w:rFonts w:ascii="Yu Gothic" w:eastAsia="Yu Gothic" w:hAnsi="Yu Gothic"/>
             <w:noProof/>
             <w:webHidden/>
           </w:rPr>
@@ -2185,14 +2193,14 @@
         </w:r>
         <w:r>
           <w:rPr>
-            <w:rFonts w:ascii="游ゴシック" w:eastAsia="游ゴシック" w:hAnsi="游ゴシック"/>
-            <w:noProof/>
-            <w:webHidden/>
-          </w:rPr>
-        </w:r>
-        <w:r>
-          <w:rPr>
-            <w:rFonts w:ascii="游ゴシック" w:eastAsia="游ゴシック" w:hAnsi="游ゴシック"/>
+            <w:rFonts w:ascii="Yu Gothic" w:eastAsia="Yu Gothic" w:hAnsi="Yu Gothic"/>
+            <w:noProof/>
+            <w:webHidden/>
+          </w:rPr>
+        </w:r>
+        <w:r>
+          <w:rPr>
+            <w:rFonts w:ascii="Yu Gothic" w:eastAsia="Yu Gothic" w:hAnsi="Yu Gothic"/>
             <w:noProof/>
             <w:webHidden/>
           </w:rPr>
@@ -2200,7 +2208,7 @@
         </w:r>
         <w:r>
           <w:rPr>
-            <w:rFonts w:ascii="游ゴシック" w:eastAsia="游ゴシック" w:hAnsi="游ゴシック"/>
+            <w:rFonts w:ascii="Yu Gothic" w:eastAsia="Yu Gothic" w:hAnsi="Yu Gothic"/>
             <w:noProof/>
             <w:webHidden/>
           </w:rPr>
@@ -2208,7 +2216,7 @@
         </w:r>
         <w:r>
           <w:rPr>
-            <w:rFonts w:ascii="游ゴシック" w:eastAsia="游ゴシック" w:hAnsi="游ゴシック"/>
+            <w:rFonts w:ascii="Yu Gothic" w:eastAsia="Yu Gothic" w:hAnsi="Yu Gothic"/>
             <w:noProof/>
             <w:webHidden/>
           </w:rPr>
@@ -2220,7 +2228,7 @@
       <w:pPr>
         <w:pStyle w:val="10"/>
         <w:rPr>
-          <w:rFonts w:ascii="游ゴシック" w:eastAsia="游ゴシック" w:hAnsi="游ゴシック"/>
+          <w:rFonts w:ascii="Yu Gothic" w:eastAsia="Yu Gothic" w:hAnsi="Yu Gothic"/>
           <w:noProof/>
           <w:szCs w:val="22"/>
         </w:rPr>
@@ -2229,14 +2237,14 @@
         <w:r>
           <w:rPr>
             <w:rStyle w:val="a4"/>
-            <w:rFonts w:ascii="游ゴシック" w:eastAsia="游ゴシック" w:hAnsi="游ゴシック" w:cs="Arial"/>
+            <w:rFonts w:ascii="Yu Gothic" w:eastAsia="Yu Gothic" w:hAnsi="Yu Gothic" w:cs="Arial"/>
             <w:noProof/>
           </w:rPr>
           <w:t>3.</w:t>
         </w:r>
         <w:r>
           <w:rPr>
-            <w:rFonts w:ascii="游ゴシック" w:eastAsia="游ゴシック" w:hAnsi="游ゴシック"/>
+            <w:rFonts w:ascii="Yu Gothic" w:eastAsia="Yu Gothic" w:hAnsi="Yu Gothic"/>
             <w:noProof/>
             <w:szCs w:val="22"/>
           </w:rPr>
@@ -2245,14 +2253,14 @@
         <w:r>
           <w:rPr>
             <w:rStyle w:val="a4"/>
-            <w:rFonts w:ascii="游ゴシック" w:eastAsia="游ゴシック" w:hAnsi="游ゴシック"/>
+            <w:rFonts w:ascii="Yu Gothic" w:eastAsia="Yu Gothic" w:hAnsi="Yu Gothic"/>
             <w:noProof/>
           </w:rPr>
           <w:t>試験に役立つその他の情報</w:t>
         </w:r>
         <w:r>
           <w:rPr>
-            <w:rFonts w:ascii="游ゴシック" w:eastAsia="游ゴシック" w:hAnsi="游ゴシック"/>
+            <w:rFonts w:ascii="Yu Gothic" w:eastAsia="Yu Gothic" w:hAnsi="Yu Gothic"/>
             <w:noProof/>
             <w:webHidden/>
           </w:rPr>
@@ -2260,7 +2268,7 @@
         </w:r>
         <w:r>
           <w:rPr>
-            <w:rFonts w:ascii="游ゴシック" w:eastAsia="游ゴシック" w:hAnsi="游ゴシック"/>
+            <w:rFonts w:ascii="Yu Gothic" w:eastAsia="Yu Gothic" w:hAnsi="Yu Gothic"/>
             <w:noProof/>
             <w:webHidden/>
           </w:rPr>
@@ -2268,7 +2276,7 @@
         </w:r>
         <w:r>
           <w:rPr>
-            <w:rFonts w:ascii="游ゴシック" w:eastAsia="游ゴシック" w:hAnsi="游ゴシック"/>
+            <w:rFonts w:ascii="Yu Gothic" w:eastAsia="Yu Gothic" w:hAnsi="Yu Gothic"/>
             <w:noProof/>
             <w:webHidden/>
           </w:rPr>
@@ -2276,14 +2284,14 @@
         </w:r>
         <w:r>
           <w:rPr>
-            <w:rFonts w:ascii="游ゴシック" w:eastAsia="游ゴシック" w:hAnsi="游ゴシック"/>
-            <w:noProof/>
-            <w:webHidden/>
-          </w:rPr>
-        </w:r>
-        <w:r>
-          <w:rPr>
-            <w:rFonts w:ascii="游ゴシック" w:eastAsia="游ゴシック" w:hAnsi="游ゴシック"/>
+            <w:rFonts w:ascii="Yu Gothic" w:eastAsia="Yu Gothic" w:hAnsi="Yu Gothic"/>
+            <w:noProof/>
+            <w:webHidden/>
+          </w:rPr>
+        </w:r>
+        <w:r>
+          <w:rPr>
+            <w:rFonts w:ascii="Yu Gothic" w:eastAsia="Yu Gothic" w:hAnsi="Yu Gothic"/>
             <w:noProof/>
             <w:webHidden/>
           </w:rPr>
@@ -2291,7 +2299,7 @@
         </w:r>
         <w:r>
           <w:rPr>
-            <w:rFonts w:ascii="游ゴシック" w:eastAsia="游ゴシック" w:hAnsi="游ゴシック"/>
+            <w:rFonts w:ascii="Yu Gothic" w:eastAsia="Yu Gothic" w:hAnsi="Yu Gothic"/>
             <w:noProof/>
             <w:webHidden/>
           </w:rPr>
@@ -2299,7 +2307,7 @@
         </w:r>
         <w:r>
           <w:rPr>
-            <w:rFonts w:ascii="游ゴシック" w:eastAsia="游ゴシック" w:hAnsi="游ゴシック"/>
+            <w:rFonts w:ascii="Yu Gothic" w:eastAsia="Yu Gothic" w:hAnsi="Yu Gothic"/>
             <w:noProof/>
             <w:webHidden/>
           </w:rPr>
@@ -2315,7 +2323,7 @@
           <w:tab w:val="right" w:leader="dot" w:pos="9900"/>
         </w:tabs>
         <w:rPr>
-          <w:rFonts w:ascii="游ゴシック" w:eastAsia="游ゴシック" w:hAnsi="游ゴシック"/>
+          <w:rFonts w:ascii="Yu Gothic" w:eastAsia="Yu Gothic" w:hAnsi="Yu Gothic"/>
           <w:noProof/>
           <w:szCs w:val="22"/>
         </w:rPr>
@@ -2324,14 +2332,14 @@
         <w:r>
           <w:rPr>
             <w:rStyle w:val="a4"/>
-            <w:rFonts w:ascii="游ゴシック" w:eastAsia="游ゴシック" w:hAnsi="游ゴシック" w:cs="Arial"/>
+            <w:rFonts w:ascii="Yu Gothic" w:eastAsia="Yu Gothic" w:hAnsi="Yu Gothic" w:cs="Arial"/>
             <w:noProof/>
           </w:rPr>
           <w:t>3.1</w:t>
         </w:r>
         <w:r>
           <w:rPr>
-            <w:rFonts w:ascii="游ゴシック" w:eastAsia="游ゴシック" w:hAnsi="游ゴシック"/>
+            <w:rFonts w:ascii="Yu Gothic" w:eastAsia="Yu Gothic" w:hAnsi="Yu Gothic"/>
             <w:noProof/>
             <w:szCs w:val="22"/>
           </w:rPr>
@@ -2340,14 +2348,14 @@
         <w:r>
           <w:rPr>
             <w:rStyle w:val="a4"/>
-            <w:rFonts w:ascii="游ゴシック" w:eastAsia="游ゴシック" w:hAnsi="游ゴシック" w:cs="Arial"/>
+            <w:rFonts w:ascii="Yu Gothic" w:eastAsia="Yu Gothic" w:hAnsi="Yu Gothic" w:cs="Arial"/>
             <w:noProof/>
           </w:rPr>
           <w:t>JIS X 8341-3:2016 規格書および関連文書</w:t>
         </w:r>
         <w:r>
           <w:rPr>
-            <w:rFonts w:ascii="游ゴシック" w:eastAsia="游ゴシック" w:hAnsi="游ゴシック"/>
+            <w:rFonts w:ascii="Yu Gothic" w:eastAsia="Yu Gothic" w:hAnsi="Yu Gothic"/>
             <w:noProof/>
             <w:webHidden/>
           </w:rPr>
@@ -2355,7 +2363,7 @@
         </w:r>
         <w:r>
           <w:rPr>
-            <w:rFonts w:ascii="游ゴシック" w:eastAsia="游ゴシック" w:hAnsi="游ゴシック"/>
+            <w:rFonts w:ascii="Yu Gothic" w:eastAsia="Yu Gothic" w:hAnsi="Yu Gothic"/>
             <w:noProof/>
             <w:webHidden/>
           </w:rPr>
@@ -2363,7 +2371,7 @@
         </w:r>
         <w:r>
           <w:rPr>
-            <w:rFonts w:ascii="游ゴシック" w:eastAsia="游ゴシック" w:hAnsi="游ゴシック"/>
+            <w:rFonts w:ascii="Yu Gothic" w:eastAsia="Yu Gothic" w:hAnsi="Yu Gothic"/>
             <w:noProof/>
             <w:webHidden/>
           </w:rPr>
@@ -2371,14 +2379,14 @@
         </w:r>
         <w:r>
           <w:rPr>
-            <w:rFonts w:ascii="游ゴシック" w:eastAsia="游ゴシック" w:hAnsi="游ゴシック"/>
-            <w:noProof/>
-            <w:webHidden/>
-          </w:rPr>
-        </w:r>
-        <w:r>
-          <w:rPr>
-            <w:rFonts w:ascii="游ゴシック" w:eastAsia="游ゴシック" w:hAnsi="游ゴシック"/>
+            <w:rFonts w:ascii="Yu Gothic" w:eastAsia="Yu Gothic" w:hAnsi="Yu Gothic"/>
+            <w:noProof/>
+            <w:webHidden/>
+          </w:rPr>
+        </w:r>
+        <w:r>
+          <w:rPr>
+            <w:rFonts w:ascii="Yu Gothic" w:eastAsia="Yu Gothic" w:hAnsi="Yu Gothic"/>
             <w:noProof/>
             <w:webHidden/>
           </w:rPr>
@@ -2386,7 +2394,7 @@
         </w:r>
         <w:r>
           <w:rPr>
-            <w:rFonts w:ascii="游ゴシック" w:eastAsia="游ゴシック" w:hAnsi="游ゴシック"/>
+            <w:rFonts w:ascii="Yu Gothic" w:eastAsia="Yu Gothic" w:hAnsi="Yu Gothic"/>
             <w:noProof/>
             <w:webHidden/>
           </w:rPr>
@@ -2394,7 +2402,7 @@
         </w:r>
         <w:r>
           <w:rPr>
-            <w:rFonts w:ascii="游ゴシック" w:eastAsia="游ゴシック" w:hAnsi="游ゴシック"/>
+            <w:rFonts w:ascii="Yu Gothic" w:eastAsia="Yu Gothic" w:hAnsi="Yu Gothic"/>
             <w:noProof/>
             <w:webHidden/>
           </w:rPr>
@@ -2410,7 +2418,7 @@
           <w:tab w:val="right" w:leader="dot" w:pos="9900"/>
         </w:tabs>
         <w:rPr>
-          <w:rFonts w:ascii="游ゴシック" w:eastAsia="游ゴシック" w:hAnsi="游ゴシック"/>
+          <w:rFonts w:ascii="Yu Gothic" w:eastAsia="Yu Gothic" w:hAnsi="Yu Gothic"/>
           <w:noProof/>
           <w:szCs w:val="22"/>
         </w:rPr>
@@ -2419,14 +2427,14 @@
         <w:r>
           <w:rPr>
             <w:rStyle w:val="a4"/>
-            <w:rFonts w:ascii="游ゴシック" w:eastAsia="游ゴシック" w:hAnsi="游ゴシック" w:cs="Arial"/>
+            <w:rFonts w:ascii="Yu Gothic" w:eastAsia="Yu Gothic" w:hAnsi="Yu Gothic" w:cs="Arial"/>
             <w:noProof/>
           </w:rPr>
           <w:t>3.1.1</w:t>
         </w:r>
         <w:r>
           <w:rPr>
-            <w:rFonts w:ascii="游ゴシック" w:eastAsia="游ゴシック" w:hAnsi="游ゴシック"/>
+            <w:rFonts w:ascii="Yu Gothic" w:eastAsia="Yu Gothic" w:hAnsi="Yu Gothic"/>
             <w:noProof/>
             <w:szCs w:val="22"/>
           </w:rPr>
@@ -2435,14 +2443,14 @@
         <w:r>
           <w:rPr>
             <w:rStyle w:val="a4"/>
-            <w:rFonts w:ascii="游ゴシック" w:eastAsia="游ゴシック" w:hAnsi="游ゴシック"/>
+            <w:rFonts w:ascii="Yu Gothic" w:eastAsia="Yu Gothic" w:hAnsi="Yu Gothic"/>
             <w:noProof/>
           </w:rPr>
           <w:t>JIS X 8341-3:2016 規格本体</w:t>
         </w:r>
         <w:r>
           <w:rPr>
-            <w:rFonts w:ascii="游ゴシック" w:eastAsia="游ゴシック" w:hAnsi="游ゴシック"/>
+            <w:rFonts w:ascii="Yu Gothic" w:eastAsia="Yu Gothic" w:hAnsi="Yu Gothic"/>
             <w:noProof/>
             <w:webHidden/>
           </w:rPr>
@@ -2450,7 +2458,7 @@
         </w:r>
         <w:r>
           <w:rPr>
-            <w:rFonts w:ascii="游ゴシック" w:eastAsia="游ゴシック" w:hAnsi="游ゴシック"/>
+            <w:rFonts w:ascii="Yu Gothic" w:eastAsia="Yu Gothic" w:hAnsi="Yu Gothic"/>
             <w:noProof/>
             <w:webHidden/>
           </w:rPr>
@@ -2458,7 +2466,7 @@
         </w:r>
         <w:r>
           <w:rPr>
-            <w:rFonts w:ascii="游ゴシック" w:eastAsia="游ゴシック" w:hAnsi="游ゴシック"/>
+            <w:rFonts w:ascii="Yu Gothic" w:eastAsia="Yu Gothic" w:hAnsi="Yu Gothic"/>
             <w:noProof/>
             <w:webHidden/>
           </w:rPr>
@@ -2466,14 +2474,14 @@
         </w:r>
         <w:r>
           <w:rPr>
-            <w:rFonts w:ascii="游ゴシック" w:eastAsia="游ゴシック" w:hAnsi="游ゴシック"/>
-            <w:noProof/>
-            <w:webHidden/>
-          </w:rPr>
-        </w:r>
-        <w:r>
-          <w:rPr>
-            <w:rFonts w:ascii="游ゴシック" w:eastAsia="游ゴシック" w:hAnsi="游ゴシック"/>
+            <w:rFonts w:ascii="Yu Gothic" w:eastAsia="Yu Gothic" w:hAnsi="Yu Gothic"/>
+            <w:noProof/>
+            <w:webHidden/>
+          </w:rPr>
+        </w:r>
+        <w:r>
+          <w:rPr>
+            <w:rFonts w:ascii="Yu Gothic" w:eastAsia="Yu Gothic" w:hAnsi="Yu Gothic"/>
             <w:noProof/>
             <w:webHidden/>
           </w:rPr>
@@ -2481,7 +2489,7 @@
         </w:r>
         <w:r>
           <w:rPr>
-            <w:rFonts w:ascii="游ゴシック" w:eastAsia="游ゴシック" w:hAnsi="游ゴシック"/>
+            <w:rFonts w:ascii="Yu Gothic" w:eastAsia="Yu Gothic" w:hAnsi="Yu Gothic"/>
             <w:noProof/>
             <w:webHidden/>
           </w:rPr>
@@ -2489,7 +2497,7 @@
         </w:r>
         <w:r>
           <w:rPr>
-            <w:rFonts w:ascii="游ゴシック" w:eastAsia="游ゴシック" w:hAnsi="游ゴシック"/>
+            <w:rFonts w:ascii="Yu Gothic" w:eastAsia="Yu Gothic" w:hAnsi="Yu Gothic"/>
             <w:noProof/>
             <w:webHidden/>
           </w:rPr>
@@ -2505,7 +2513,7 @@
           <w:tab w:val="right" w:leader="dot" w:pos="9900"/>
         </w:tabs>
         <w:rPr>
-          <w:rFonts w:ascii="游ゴシック" w:eastAsia="游ゴシック" w:hAnsi="游ゴシック"/>
+          <w:rFonts w:ascii="Yu Gothic" w:eastAsia="Yu Gothic" w:hAnsi="Yu Gothic"/>
           <w:noProof/>
           <w:szCs w:val="22"/>
         </w:rPr>
@@ -2514,14 +2522,14 @@
         <w:r>
           <w:rPr>
             <w:rStyle w:val="a4"/>
-            <w:rFonts w:ascii="游ゴシック" w:eastAsia="游ゴシック" w:hAnsi="游ゴシック" w:cs="Arial"/>
+            <w:rFonts w:ascii="Yu Gothic" w:eastAsia="Yu Gothic" w:hAnsi="Yu Gothic" w:cs="Arial"/>
             <w:noProof/>
           </w:rPr>
           <w:t>3.1.2</w:t>
         </w:r>
         <w:r>
           <w:rPr>
-            <w:rFonts w:ascii="游ゴシック" w:eastAsia="游ゴシック" w:hAnsi="游ゴシック"/>
+            <w:rFonts w:ascii="Yu Gothic" w:eastAsia="Yu Gothic" w:hAnsi="Yu Gothic"/>
             <w:noProof/>
             <w:szCs w:val="22"/>
           </w:rPr>
@@ -2530,14 +2538,14 @@
         <w:r>
           <w:rPr>
             <w:rStyle w:val="a4"/>
-            <w:rFonts w:ascii="游ゴシック" w:eastAsia="游ゴシック" w:hAnsi="游ゴシック"/>
+            <w:rFonts w:ascii="Yu Gothic" w:eastAsia="Yu Gothic" w:hAnsi="Yu Gothic"/>
             <w:noProof/>
           </w:rPr>
           <w:t>JIS X 8341-3:2016 関連文書</w:t>
         </w:r>
         <w:r>
           <w:rPr>
-            <w:rFonts w:ascii="游ゴシック" w:eastAsia="游ゴシック" w:hAnsi="游ゴシック"/>
+            <w:rFonts w:ascii="Yu Gothic" w:eastAsia="Yu Gothic" w:hAnsi="Yu Gothic"/>
             <w:noProof/>
             <w:webHidden/>
           </w:rPr>
@@ -2545,7 +2553,7 @@
         </w:r>
         <w:r>
           <w:rPr>
-            <w:rFonts w:ascii="游ゴシック" w:eastAsia="游ゴシック" w:hAnsi="游ゴシック"/>
+            <w:rFonts w:ascii="Yu Gothic" w:eastAsia="Yu Gothic" w:hAnsi="Yu Gothic"/>
             <w:noProof/>
             <w:webHidden/>
           </w:rPr>
@@ -2553,7 +2561,7 @@
         </w:r>
         <w:r>
           <w:rPr>
-            <w:rFonts w:ascii="游ゴシック" w:eastAsia="游ゴシック" w:hAnsi="游ゴシック"/>
+            <w:rFonts w:ascii="Yu Gothic" w:eastAsia="Yu Gothic" w:hAnsi="Yu Gothic"/>
             <w:noProof/>
             <w:webHidden/>
           </w:rPr>
@@ -2561,14 +2569,14 @@
         </w:r>
         <w:r>
           <w:rPr>
-            <w:rFonts w:ascii="游ゴシック" w:eastAsia="游ゴシック" w:hAnsi="游ゴシック"/>
-            <w:noProof/>
-            <w:webHidden/>
-          </w:rPr>
-        </w:r>
-        <w:r>
-          <w:rPr>
-            <w:rFonts w:ascii="游ゴシック" w:eastAsia="游ゴシック" w:hAnsi="游ゴシック"/>
+            <w:rFonts w:ascii="Yu Gothic" w:eastAsia="Yu Gothic" w:hAnsi="Yu Gothic"/>
+            <w:noProof/>
+            <w:webHidden/>
+          </w:rPr>
+        </w:r>
+        <w:r>
+          <w:rPr>
+            <w:rFonts w:ascii="Yu Gothic" w:eastAsia="Yu Gothic" w:hAnsi="Yu Gothic"/>
             <w:noProof/>
             <w:webHidden/>
           </w:rPr>
@@ -2576,7 +2584,7 @@
         </w:r>
         <w:r>
           <w:rPr>
-            <w:rFonts w:ascii="游ゴシック" w:eastAsia="游ゴシック" w:hAnsi="游ゴシック"/>
+            <w:rFonts w:ascii="Yu Gothic" w:eastAsia="Yu Gothic" w:hAnsi="Yu Gothic"/>
             <w:noProof/>
             <w:webHidden/>
           </w:rPr>
@@ -2584,7 +2592,7 @@
         </w:r>
         <w:r>
           <w:rPr>
-            <w:rFonts w:ascii="游ゴシック" w:eastAsia="游ゴシック" w:hAnsi="游ゴシック"/>
+            <w:rFonts w:ascii="Yu Gothic" w:eastAsia="Yu Gothic" w:hAnsi="Yu Gothic"/>
             <w:noProof/>
             <w:webHidden/>
           </w:rPr>
@@ -2600,7 +2608,7 @@
           <w:tab w:val="right" w:leader="dot" w:pos="9900"/>
         </w:tabs>
         <w:rPr>
-          <w:rFonts w:ascii="游ゴシック" w:eastAsia="游ゴシック" w:hAnsi="游ゴシック"/>
+          <w:rFonts w:ascii="Yu Gothic" w:eastAsia="Yu Gothic" w:hAnsi="Yu Gothic"/>
           <w:noProof/>
           <w:szCs w:val="22"/>
         </w:rPr>
@@ -2609,14 +2617,14 @@
         <w:r>
           <w:rPr>
             <w:rStyle w:val="a4"/>
-            <w:rFonts w:ascii="游ゴシック" w:eastAsia="游ゴシック" w:hAnsi="游ゴシック" w:cs="Arial"/>
+            <w:rFonts w:ascii="Yu Gothic" w:eastAsia="Yu Gothic" w:hAnsi="Yu Gothic" w:cs="Arial"/>
             <w:noProof/>
           </w:rPr>
           <w:t>3.1.3</w:t>
         </w:r>
         <w:r>
           <w:rPr>
-            <w:rFonts w:ascii="游ゴシック" w:eastAsia="游ゴシック" w:hAnsi="游ゴシック"/>
+            <w:rFonts w:ascii="Yu Gothic" w:eastAsia="Yu Gothic" w:hAnsi="Yu Gothic"/>
             <w:noProof/>
             <w:szCs w:val="22"/>
           </w:rPr>
@@ -2625,14 +2633,14 @@
         <w:r>
           <w:rPr>
             <w:rStyle w:val="a4"/>
-            <w:rFonts w:ascii="游ゴシック" w:eastAsia="游ゴシック" w:hAnsi="游ゴシック"/>
+            <w:rFonts w:ascii="Yu Gothic" w:eastAsia="Yu Gothic" w:hAnsi="Yu Gothic"/>
             <w:noProof/>
           </w:rPr>
           <w:t>WCAG 2.0 関連 翻訳文書</w:t>
         </w:r>
         <w:r>
           <w:rPr>
-            <w:rFonts w:ascii="游ゴシック" w:eastAsia="游ゴシック" w:hAnsi="游ゴシック"/>
+            <w:rFonts w:ascii="Yu Gothic" w:eastAsia="Yu Gothic" w:hAnsi="Yu Gothic"/>
             <w:noProof/>
             <w:webHidden/>
           </w:rPr>
@@ -2640,7 +2648,7 @@
         </w:r>
         <w:r>
           <w:rPr>
-            <w:rFonts w:ascii="游ゴシック" w:eastAsia="游ゴシック" w:hAnsi="游ゴシック"/>
+            <w:rFonts w:ascii="Yu Gothic" w:eastAsia="Yu Gothic" w:hAnsi="Yu Gothic"/>
             <w:noProof/>
             <w:webHidden/>
           </w:rPr>
@@ -2648,7 +2656,7 @@
         </w:r>
         <w:r>
           <w:rPr>
-            <w:rFonts w:ascii="游ゴシック" w:eastAsia="游ゴシック" w:hAnsi="游ゴシック"/>
+            <w:rFonts w:ascii="Yu Gothic" w:eastAsia="Yu Gothic" w:hAnsi="Yu Gothic"/>
             <w:noProof/>
             <w:webHidden/>
           </w:rPr>
@@ -2656,14 +2664,14 @@
         </w:r>
         <w:r>
           <w:rPr>
-            <w:rFonts w:ascii="游ゴシック" w:eastAsia="游ゴシック" w:hAnsi="游ゴシック"/>
-            <w:noProof/>
-            <w:webHidden/>
-          </w:rPr>
-        </w:r>
-        <w:r>
-          <w:rPr>
-            <w:rFonts w:ascii="游ゴシック" w:eastAsia="游ゴシック" w:hAnsi="游ゴシック"/>
+            <w:rFonts w:ascii="Yu Gothic" w:eastAsia="Yu Gothic" w:hAnsi="Yu Gothic"/>
+            <w:noProof/>
+            <w:webHidden/>
+          </w:rPr>
+        </w:r>
+        <w:r>
+          <w:rPr>
+            <w:rFonts w:ascii="Yu Gothic" w:eastAsia="Yu Gothic" w:hAnsi="Yu Gothic"/>
             <w:noProof/>
             <w:webHidden/>
           </w:rPr>
@@ -2671,7 +2679,7 @@
         </w:r>
         <w:r>
           <w:rPr>
-            <w:rFonts w:ascii="游ゴシック" w:eastAsia="游ゴシック" w:hAnsi="游ゴシック"/>
+            <w:rFonts w:ascii="Yu Gothic" w:eastAsia="Yu Gothic" w:hAnsi="Yu Gothic"/>
             <w:noProof/>
             <w:webHidden/>
           </w:rPr>
@@ -2679,7 +2687,7 @@
         </w:r>
         <w:r>
           <w:rPr>
-            <w:rFonts w:ascii="游ゴシック" w:eastAsia="游ゴシック" w:hAnsi="游ゴシック"/>
+            <w:rFonts w:ascii="Yu Gothic" w:eastAsia="Yu Gothic" w:hAnsi="Yu Gothic"/>
             <w:noProof/>
             <w:webHidden/>
           </w:rPr>
@@ -2695,7 +2703,7 @@
           <w:tab w:val="right" w:leader="dot" w:pos="9900"/>
         </w:tabs>
         <w:rPr>
-          <w:rFonts w:ascii="游ゴシック" w:eastAsia="游ゴシック" w:hAnsi="游ゴシック"/>
+          <w:rFonts w:ascii="Yu Gothic" w:eastAsia="Yu Gothic" w:hAnsi="Yu Gothic"/>
           <w:noProof/>
           <w:szCs w:val="22"/>
         </w:rPr>
@@ -2704,14 +2712,14 @@
         <w:r>
           <w:rPr>
             <w:rStyle w:val="a4"/>
-            <w:rFonts w:ascii="游ゴシック" w:eastAsia="游ゴシック" w:hAnsi="游ゴシック" w:cs="Arial"/>
+            <w:rFonts w:ascii="Yu Gothic" w:eastAsia="Yu Gothic" w:hAnsi="Yu Gothic" w:cs="Arial"/>
             <w:noProof/>
           </w:rPr>
           <w:t>3.2</w:t>
         </w:r>
         <w:r>
           <w:rPr>
-            <w:rFonts w:ascii="游ゴシック" w:eastAsia="游ゴシック" w:hAnsi="游ゴシック"/>
+            <w:rFonts w:ascii="Yu Gothic" w:eastAsia="Yu Gothic" w:hAnsi="Yu Gothic"/>
             <w:noProof/>
             <w:szCs w:val="22"/>
           </w:rPr>
@@ -2720,14 +2728,14 @@
         <w:r>
           <w:rPr>
             <w:rStyle w:val="a4"/>
-            <w:rFonts w:ascii="游ゴシック" w:eastAsia="游ゴシック" w:hAnsi="游ゴシック"/>
+            <w:rFonts w:ascii="Yu Gothic" w:eastAsia="Yu Gothic" w:hAnsi="Yu Gothic"/>
             <w:noProof/>
           </w:rPr>
           <w:t>検証に役立つツール</w:t>
         </w:r>
         <w:r>
           <w:rPr>
-            <w:rFonts w:ascii="游ゴシック" w:eastAsia="游ゴシック" w:hAnsi="游ゴシック"/>
+            <w:rFonts w:ascii="Yu Gothic" w:eastAsia="Yu Gothic" w:hAnsi="Yu Gothic"/>
             <w:noProof/>
             <w:webHidden/>
           </w:rPr>
@@ -2735,7 +2743,7 @@
         </w:r>
         <w:r>
           <w:rPr>
-            <w:rFonts w:ascii="游ゴシック" w:eastAsia="游ゴシック" w:hAnsi="游ゴシック"/>
+            <w:rFonts w:ascii="Yu Gothic" w:eastAsia="Yu Gothic" w:hAnsi="Yu Gothic"/>
             <w:noProof/>
             <w:webHidden/>
           </w:rPr>
@@ -2743,7 +2751,7 @@
         </w:r>
         <w:r>
           <w:rPr>
-            <w:rFonts w:ascii="游ゴシック" w:eastAsia="游ゴシック" w:hAnsi="游ゴシック"/>
+            <w:rFonts w:ascii="Yu Gothic" w:eastAsia="Yu Gothic" w:hAnsi="Yu Gothic"/>
             <w:noProof/>
             <w:webHidden/>
           </w:rPr>
@@ -2751,14 +2759,14 @@
         </w:r>
         <w:r>
           <w:rPr>
-            <w:rFonts w:ascii="游ゴシック" w:eastAsia="游ゴシック" w:hAnsi="游ゴシック"/>
-            <w:noProof/>
-            <w:webHidden/>
-          </w:rPr>
-        </w:r>
-        <w:r>
-          <w:rPr>
-            <w:rFonts w:ascii="游ゴシック" w:eastAsia="游ゴシック" w:hAnsi="游ゴシック"/>
+            <w:rFonts w:ascii="Yu Gothic" w:eastAsia="Yu Gothic" w:hAnsi="Yu Gothic"/>
+            <w:noProof/>
+            <w:webHidden/>
+          </w:rPr>
+        </w:r>
+        <w:r>
+          <w:rPr>
+            <w:rFonts w:ascii="Yu Gothic" w:eastAsia="Yu Gothic" w:hAnsi="Yu Gothic"/>
             <w:noProof/>
             <w:webHidden/>
           </w:rPr>
@@ -2766,7 +2774,7 @@
         </w:r>
         <w:r>
           <w:rPr>
-            <w:rFonts w:ascii="游ゴシック" w:eastAsia="游ゴシック" w:hAnsi="游ゴシック"/>
+            <w:rFonts w:ascii="Yu Gothic" w:eastAsia="Yu Gothic" w:hAnsi="Yu Gothic"/>
             <w:noProof/>
             <w:webHidden/>
           </w:rPr>
@@ -2774,7 +2782,7 @@
         </w:r>
         <w:r>
           <w:rPr>
-            <w:rFonts w:ascii="游ゴシック" w:eastAsia="游ゴシック" w:hAnsi="游ゴシック"/>
+            <w:rFonts w:ascii="Yu Gothic" w:eastAsia="Yu Gothic" w:hAnsi="Yu Gothic"/>
             <w:noProof/>
             <w:webHidden/>
           </w:rPr>
@@ -2786,7 +2794,7 @@
       <w:pPr>
         <w:pStyle w:val="10"/>
         <w:rPr>
-          <w:rFonts w:ascii="游ゴシック" w:eastAsia="游ゴシック" w:hAnsi="游ゴシック"/>
+          <w:rFonts w:ascii="Yu Gothic" w:eastAsia="Yu Gothic" w:hAnsi="Yu Gothic"/>
           <w:noProof/>
           <w:szCs w:val="22"/>
         </w:rPr>
@@ -2795,14 +2803,14 @@
         <w:r>
           <w:rPr>
             <w:rStyle w:val="a4"/>
-            <w:rFonts w:ascii="游ゴシック" w:eastAsia="游ゴシック" w:hAnsi="游ゴシック" w:cs="Arial"/>
+            <w:rFonts w:ascii="Yu Gothic" w:eastAsia="Yu Gothic" w:hAnsi="Yu Gothic" w:cs="Arial"/>
             <w:noProof/>
           </w:rPr>
           <w:t>4.</w:t>
         </w:r>
         <w:r>
           <w:rPr>
-            <w:rFonts w:ascii="游ゴシック" w:eastAsia="游ゴシック" w:hAnsi="游ゴシック"/>
+            <w:rFonts w:ascii="Yu Gothic" w:eastAsia="Yu Gothic" w:hAnsi="Yu Gothic"/>
             <w:noProof/>
             <w:szCs w:val="22"/>
           </w:rPr>
@@ -2811,14 +2819,14 @@
         <w:r>
           <w:rPr>
             <w:rStyle w:val="a4"/>
-            <w:rFonts w:ascii="游ゴシック" w:eastAsia="游ゴシック" w:hAnsi="游ゴシック" w:cs="Arial"/>
+            <w:rFonts w:ascii="Yu Gothic" w:eastAsia="Yu Gothic" w:hAnsi="Yu Gothic" w:cs="Arial"/>
             <w:noProof/>
           </w:rPr>
           <w:t>注意事項</w:t>
         </w:r>
         <w:r>
           <w:rPr>
-            <w:rFonts w:ascii="游ゴシック" w:eastAsia="游ゴシック" w:hAnsi="游ゴシック"/>
+            <w:rFonts w:ascii="Yu Gothic" w:eastAsia="Yu Gothic" w:hAnsi="Yu Gothic"/>
             <w:noProof/>
             <w:webHidden/>
           </w:rPr>
@@ -2826,7 +2834,7 @@
         </w:r>
         <w:r>
           <w:rPr>
-            <w:rFonts w:ascii="游ゴシック" w:eastAsia="游ゴシック" w:hAnsi="游ゴシック"/>
+            <w:rFonts w:ascii="Yu Gothic" w:eastAsia="Yu Gothic" w:hAnsi="Yu Gothic"/>
             <w:noProof/>
             <w:webHidden/>
           </w:rPr>
@@ -2834,7 +2842,7 @@
         </w:r>
         <w:r>
           <w:rPr>
-            <w:rFonts w:ascii="游ゴシック" w:eastAsia="游ゴシック" w:hAnsi="游ゴシック"/>
+            <w:rFonts w:ascii="Yu Gothic" w:eastAsia="Yu Gothic" w:hAnsi="Yu Gothic"/>
             <w:noProof/>
             <w:webHidden/>
           </w:rPr>
@@ -2842,14 +2850,14 @@
         </w:r>
         <w:r>
           <w:rPr>
-            <w:rFonts w:ascii="游ゴシック" w:eastAsia="游ゴシック" w:hAnsi="游ゴシック"/>
-            <w:noProof/>
-            <w:webHidden/>
-          </w:rPr>
-        </w:r>
-        <w:r>
-          <w:rPr>
-            <w:rFonts w:ascii="游ゴシック" w:eastAsia="游ゴシック" w:hAnsi="游ゴシック"/>
+            <w:rFonts w:ascii="Yu Gothic" w:eastAsia="Yu Gothic" w:hAnsi="Yu Gothic"/>
+            <w:noProof/>
+            <w:webHidden/>
+          </w:rPr>
+        </w:r>
+        <w:r>
+          <w:rPr>
+            <w:rFonts w:ascii="Yu Gothic" w:eastAsia="Yu Gothic" w:hAnsi="Yu Gothic"/>
             <w:noProof/>
             <w:webHidden/>
           </w:rPr>
@@ -2857,7 +2865,7 @@
         </w:r>
         <w:r>
           <w:rPr>
-            <w:rFonts w:ascii="游ゴシック" w:eastAsia="游ゴシック" w:hAnsi="游ゴシック"/>
+            <w:rFonts w:ascii="Yu Gothic" w:eastAsia="Yu Gothic" w:hAnsi="Yu Gothic"/>
             <w:noProof/>
             <w:webHidden/>
           </w:rPr>
@@ -2865,7 +2873,7 @@
         </w:r>
         <w:r>
           <w:rPr>
-            <w:rFonts w:ascii="游ゴシック" w:eastAsia="游ゴシック" w:hAnsi="游ゴシック"/>
+            <w:rFonts w:ascii="Yu Gothic" w:eastAsia="Yu Gothic" w:hAnsi="Yu Gothic"/>
             <w:noProof/>
             <w:webHidden/>
           </w:rPr>
@@ -2876,14 +2884,14 @@
     <w:p>
       <w:pPr>
         <w:rPr>
-          <w:rFonts w:ascii="游ゴシック" w:eastAsia="游ゴシック" w:hAnsi="游ゴシック" w:cs="Arial"/>
+          <w:rFonts w:ascii="Yu Gothic" w:eastAsia="Yu Gothic" w:hAnsi="Yu Gothic" w:cs="Arial"/>
           <w:sz w:val="36"/>
           <w:szCs w:val="36"/>
         </w:rPr>
       </w:pPr>
       <w:r>
         <w:rPr>
-          <w:rFonts w:ascii="游ゴシック" w:eastAsia="游ゴシック" w:hAnsi="游ゴシック" w:cs="Arial"/>
+          <w:rFonts w:ascii="Yu Gothic" w:eastAsia="Yu Gothic" w:hAnsi="Yu Gothic" w:cs="Arial"/>
           <w:sz w:val="36"/>
           <w:szCs w:val="36"/>
         </w:rPr>
@@ -3875,7 +3883,7 @@
         </w:pBdr>
         <w:jc w:val="left"/>
         <w:rPr>
-          <w:rFonts w:ascii="HG丸ｺﾞｼｯｸM-PRO" w:eastAsia="HG丸ｺﾞｼｯｸM-PRO" w:hAnsi="HG丸ｺﾞｼｯｸM-PRO"/>
+          <w:rFonts w:ascii="HG丸ｺﾞｼｯｸM-PRO" w:eastAsia="HG丸ｺﾞｼｯｸM-PRO" w:hAnsi="HG丸ｺﾞｼｯｸM-PRO" w:hint="eastAsia"/>
         </w:rPr>
       </w:pPr>
       <w:r>
@@ -3931,6 +3939,9 @@
           <w:rFonts w:ascii="ＭＳ 明朝" w:hAnsi="ＭＳ 明朝" w:hint="eastAsia"/>
         </w:rPr>
         <w:t>。</w:t>
+      </w:r>
+      <w:r>
+        <w:br/>
       </w:r>
       <w:hyperlink r:id="rId11" w:history="1">
         <w:r>
@@ -3938,7 +3949,7 @@
             <w:rStyle w:val="a4"/>
             <w:rFonts w:ascii="HG丸ｺﾞｼｯｸM-PRO" w:eastAsia="HG丸ｺﾞｼｯｸM-PRO" w:hAnsi="HG丸ｺﾞｼｯｸM-PRO"/>
           </w:rPr>
-          <w:t>https://www.soumu.go.jp/main_sosiki/joho_tsusin/b_free/guideline.html</w:t>
+          <w:t>https://www.soumu.go.jp/info-accessibility-portal/webaccessibility/guideline/</w:t>
         </w:r>
       </w:hyperlink>
     </w:p>
@@ -4476,7 +4487,25 @@
             <w:sz w:val="16"/>
             <w:szCs w:val="22"/>
           </w:rPr>
-          <w:t>https://waic.jp/docs/jis2016/test-guidelines/202012/#h4_3_1_1_icl_example</w:t>
+          <w:t>https://waic.jp/docs/jis2016/test-guidelin</w:t>
+        </w:r>
+        <w:r>
+          <w:rPr>
+            <w:rStyle w:val="a4"/>
+            <w:rFonts w:ascii="ＭＳ Ｐ明朝" w:eastAsia="ＭＳ Ｐ明朝" w:hAnsi="ＭＳ Ｐ明朝" w:cs="Arial"/>
+            <w:sz w:val="16"/>
+            <w:szCs w:val="22"/>
+          </w:rPr>
+          <w:t>e</w:t>
+        </w:r>
+        <w:r>
+          <w:rPr>
+            <w:rStyle w:val="a4"/>
+            <w:rFonts w:ascii="ＭＳ Ｐ明朝" w:eastAsia="ＭＳ Ｐ明朝" w:hAnsi="ＭＳ Ｐ明朝" w:cs="Arial"/>
+            <w:sz w:val="16"/>
+            <w:szCs w:val="22"/>
+          </w:rPr>
+          <w:t>s/202012/#h4_3_1_1_icl_example</w:t>
         </w:r>
       </w:hyperlink>
       <w:r>
@@ -5130,21 +5159,7 @@
         <w:rPr>
           <w:rFonts w:ascii="ＭＳ Ｐ明朝" w:eastAsia="ＭＳ Ｐ明朝" w:hAnsi="ＭＳ Ｐ明朝" w:hint="eastAsia"/>
         </w:rPr>
-        <w:t>&lt;</w:t>
-      </w:r>
-      <w:proofErr w:type="spellStart"/>
-      <w:r>
-        <w:rPr>
-          <w:rFonts w:ascii="ＭＳ Ｐ明朝" w:eastAsia="ＭＳ Ｐ明朝" w:hAnsi="ＭＳ Ｐ明朝" w:hint="eastAsia"/>
-        </w:rPr>
-        <w:t>img</w:t>
-      </w:r>
-      <w:proofErr w:type="spellEnd"/>
-      <w:r>
-        <w:rPr>
-          <w:rFonts w:ascii="ＭＳ Ｐ明朝" w:eastAsia="ＭＳ Ｐ明朝" w:hAnsi="ＭＳ Ｐ明朝" w:hint="eastAsia"/>
-        </w:rPr>
-        <w:t>&gt;要素にはalt</w:t>
+        <w:t>&lt;img&gt;要素にはalt</w:t>
       </w:r>
       <w:r>
         <w:rPr>
@@ -5350,7 +5365,7 @@
           <w:noProof/>
         </w:rPr>
         <w:drawing>
-          <wp:inline distT="0" distB="0" distL="0" distR="0" wp14:anchorId="4CCBA34E" wp14:editId="4C70BE7C">
+          <wp:inline distT="0" distB="0" distL="0" distR="0" wp14:anchorId="4CCBA34E" wp14:editId="6EF8FC88">
             <wp:extent cx="6294120" cy="1668780"/>
             <wp:effectExtent l="19050" t="19050" r="0" b="7620"/>
             <wp:docPr id="1" name="図 1">
@@ -8098,18 +8113,8 @@
                 <w:sz w:val="20"/>
                 <w:szCs w:val="20"/>
               </w:rPr>
-              <w:t>ワークシート.</w:t>
-            </w:r>
-            <w:proofErr w:type="spellStart"/>
-            <w:r>
-              <w:rPr>
-                <w:rFonts w:ascii="ＭＳ Ｐ明朝" w:eastAsia="ＭＳ Ｐ明朝" w:hAnsi="ＭＳ Ｐ明朝" w:cs="Arial" w:hint="eastAsia"/>
-                <w:sz w:val="20"/>
-                <w:szCs w:val="20"/>
-              </w:rPr>
-              <w:t>xls</w:t>
-            </w:r>
-            <w:proofErr w:type="spellEnd"/>
+              <w:t>ワークシート.xls</w:t>
+            </w:r>
             <w:r>
               <w:rPr>
                 <w:rFonts w:ascii="ＭＳ Ｐ明朝" w:eastAsia="ＭＳ Ｐ明朝" w:hAnsi="ＭＳ Ｐ明朝" w:cs="Arial"/>
@@ -16659,7 +16664,7 @@
 </file>
 
 <file path=word/endnotes.xml><?xml version="1.0" encoding="utf-8"?>
-<w:endnotes xmlns:wpc="http://schemas.microsoft.com/office/word/2010/wordprocessingCanvas" xmlns:cx="http://schemas.microsoft.com/office/drawing/2014/chartex" xmlns:cx1="http://schemas.microsoft.com/office/drawing/2015/9/8/chartex" xmlns:cx2="http://schemas.microsoft.com/office/drawing/2015/10/21/chartex" xmlns:cx3="http://schemas.microsoft.com/office/drawing/2016/5/9/chartex" xmlns:cx4="http://schemas.microsoft.com/office/drawing/2016/5/10/chartex" xmlns:cx5="http://schemas.microsoft.com/office/drawing/2016/5/11/chartex" xmlns:cx6="http://schemas.microsoft.com/office/drawing/2016/5/12/chartex" xmlns:cx7="http://schemas.microsoft.com/office/drawing/2016/5/13/chartex" xmlns:cx8="http://schemas.microsoft.com/office/drawing/2016/5/14/chartex" xmlns:mc="http://schemas.openxmlformats.org/markup-compatibility/2006" xmlns:aink="http://schemas.microsoft.com/office/drawing/2016/ink" xmlns:am3d="http://schemas.microsoft.com/office/drawing/2017/model3d" xmlns:o="urn:schemas-microsoft-com:office:office" xmlns:oel="http://schemas.microsoft.com/office/2019/extlst" xmlns:r="http://schemas.openxmlformats.org/officeDocument/2006/relationships" xmlns:m="http://schemas.openxmlformats.org/officeDocument/2006/math" xmlns:v="urn:schemas-microsoft-com:vml" xmlns:wp14="http://schemas.microsoft.com/office/word/2010/wordprocessingDrawing" xmlns:wp="http://schemas.openxmlformats.org/drawingml/2006/wordprocessingDrawing" xmlns:w10="urn:schemas-microsoft-com:office:word" xmlns:w="http://schemas.openxmlformats.org/wordprocessingml/2006/main" xmlns:w14="http://schemas.microsoft.com/office/word/2010/wordml" xmlns:w15="http://schemas.microsoft.com/office/word/2012/wordml" xmlns:w16cex="http://schemas.microsoft.com/office/word/2018/wordml/cex" xmlns:w16cid="http://schemas.microsoft.com/office/word/2016/wordml/cid" xmlns:w16="http://schemas.microsoft.com/office/word/2018/wordml" xmlns:w16sdtdh="http://schemas.microsoft.com/office/word/2020/wordml/sdtdatahash" xmlns:w16se="http://schemas.microsoft.com/office/word/2015/wordml/symex" xmlns:wpg="http://schemas.microsoft.com/office/word/2010/wordprocessingGroup" xmlns:wpi="http://schemas.microsoft.com/office/word/2010/wordprocessingInk" xmlns:wne="http://schemas.microsoft.com/office/word/2006/wordml" xmlns:wps="http://schemas.microsoft.com/office/word/2010/wordprocessingShape" mc:Ignorable="w14 w15 w16se w16cid w16 w16cex w16sdtdh wp14">
+<w:endnotes xmlns:wpc="http://schemas.microsoft.com/office/word/2010/wordprocessingCanvas" xmlns:cx="http://schemas.microsoft.com/office/drawing/2014/chartex" xmlns:cx1="http://schemas.microsoft.com/office/drawing/2015/9/8/chartex" xmlns:cx2="http://schemas.microsoft.com/office/drawing/2015/10/21/chartex" xmlns:cx3="http://schemas.microsoft.com/office/drawing/2016/5/9/chartex" xmlns:cx4="http://schemas.microsoft.com/office/drawing/2016/5/10/chartex" xmlns:cx5="http://schemas.microsoft.com/office/drawing/2016/5/11/chartex" xmlns:cx6="http://schemas.microsoft.com/office/drawing/2016/5/12/chartex" xmlns:cx7="http://schemas.microsoft.com/office/drawing/2016/5/13/chartex" xmlns:cx8="http://schemas.microsoft.com/office/drawing/2016/5/14/chartex" xmlns:mc="http://schemas.openxmlformats.org/markup-compatibility/2006" xmlns:aink="http://schemas.microsoft.com/office/drawing/2016/ink" xmlns:am3d="http://schemas.microsoft.com/office/drawing/2017/model3d" xmlns:o="urn:schemas-microsoft-com:office:office" xmlns:oel="http://schemas.microsoft.com/office/2019/extlst" xmlns:r="http://schemas.openxmlformats.org/officeDocument/2006/relationships" xmlns:m="http://schemas.openxmlformats.org/officeDocument/2006/math" xmlns:v="urn:schemas-microsoft-com:vml" xmlns:wp14="http://schemas.microsoft.com/office/word/2010/wordprocessingDrawing" xmlns:wp="http://schemas.openxmlformats.org/drawingml/2006/wordprocessingDrawing" xmlns:w10="urn:schemas-microsoft-com:office:word" xmlns:w="http://schemas.openxmlformats.org/wordprocessingml/2006/main" xmlns:w14="http://schemas.microsoft.com/office/word/2010/wordml" xmlns:w15="http://schemas.microsoft.com/office/word/2012/wordml" xmlns:w16cex="http://schemas.microsoft.com/office/word/2018/wordml/cex" xmlns:w16cid="http://schemas.microsoft.com/office/word/2016/wordml/cid" xmlns:w16="http://schemas.microsoft.com/office/word/2018/wordml" xmlns:w16du="http://schemas.microsoft.com/office/word/2023/wordml/word16du" xmlns:w16sdtdh="http://schemas.microsoft.com/office/word/2020/wordml/sdtdatahash" xmlns:w16sdtfl="http://schemas.microsoft.com/office/word/2024/wordml/sdtformatlock" xmlns:w16se="http://schemas.microsoft.com/office/word/2015/wordml/symex" xmlns:wpg="http://schemas.microsoft.com/office/word/2010/wordprocessingGroup" xmlns:wpi="http://schemas.microsoft.com/office/word/2010/wordprocessingInk" xmlns:wne="http://schemas.microsoft.com/office/word/2006/wordml" xmlns:wps="http://schemas.microsoft.com/office/word/2010/wordprocessingShape" mc:Ignorable="w14 w15 w16se w16cid w16 w16cex w16sdtdh w16sdtfl w16du wp14">
   <w:endnote w:type="separator" w:id="-1">
     <w:p>
       <w:r>
@@ -16678,7 +16683,7 @@
 </file>
 
 <file path=word/footer1.xml><?xml version="1.0" encoding="utf-8"?>
-<w:ftr xmlns:wpc="http://schemas.microsoft.com/office/word/2010/wordprocessingCanvas" xmlns:cx="http://schemas.microsoft.com/office/drawing/2014/chartex" xmlns:cx1="http://schemas.microsoft.com/office/drawing/2015/9/8/chartex" xmlns:cx2="http://schemas.microsoft.com/office/drawing/2015/10/21/chartex" xmlns:cx3="http://schemas.microsoft.com/office/drawing/2016/5/9/chartex" xmlns:cx4="http://schemas.microsoft.com/office/drawing/2016/5/10/chartex" xmlns:cx5="http://schemas.microsoft.com/office/drawing/2016/5/11/chartex" xmlns:cx6="http://schemas.microsoft.com/office/drawing/2016/5/12/chartex" xmlns:cx7="http://schemas.microsoft.com/office/drawing/2016/5/13/chartex" xmlns:cx8="http://schemas.microsoft.com/office/drawing/2016/5/14/chartex" xmlns:mc="http://schemas.openxmlformats.org/markup-compatibility/2006" xmlns:aink="http://schemas.microsoft.com/office/drawing/2016/ink" xmlns:am3d="http://schemas.microsoft.com/office/drawing/2017/model3d" xmlns:o="urn:schemas-microsoft-com:office:office" xmlns:oel="http://schemas.microsoft.com/office/2019/extlst" xmlns:r="http://schemas.openxmlformats.org/officeDocument/2006/relationships" xmlns:m="http://schemas.openxmlformats.org/officeDocument/2006/math" xmlns:v="urn:schemas-microsoft-com:vml" xmlns:wp14="http://schemas.microsoft.com/office/word/2010/wordprocessingDrawing" xmlns:wp="http://schemas.openxmlformats.org/drawingml/2006/wordprocessingDrawing" xmlns:w10="urn:schemas-microsoft-com:office:word" xmlns:w="http://schemas.openxmlformats.org/wordprocessingml/2006/main" xmlns:w14="http://schemas.microsoft.com/office/word/2010/wordml" xmlns:w15="http://schemas.microsoft.com/office/word/2012/wordml" xmlns:w16cex="http://schemas.microsoft.com/office/word/2018/wordml/cex" xmlns:w16cid="http://schemas.microsoft.com/office/word/2016/wordml/cid" xmlns:w16="http://schemas.microsoft.com/office/word/2018/wordml" xmlns:w16sdtdh="http://schemas.microsoft.com/office/word/2020/wordml/sdtdatahash" xmlns:w16se="http://schemas.microsoft.com/office/word/2015/wordml/symex" xmlns:wpg="http://schemas.microsoft.com/office/word/2010/wordprocessingGroup" xmlns:wpi="http://schemas.microsoft.com/office/word/2010/wordprocessingInk" xmlns:wne="http://schemas.microsoft.com/office/word/2006/wordml" xmlns:wps="http://schemas.microsoft.com/office/word/2010/wordprocessingShape" mc:Ignorable="w14 w15 w16se w16cid w16 w16cex w16sdtdh wp14">
+<w:ftr xmlns:wpc="http://schemas.microsoft.com/office/word/2010/wordprocessingCanvas" xmlns:cx="http://schemas.microsoft.com/office/drawing/2014/chartex" xmlns:cx1="http://schemas.microsoft.com/office/drawing/2015/9/8/chartex" xmlns:cx2="http://schemas.microsoft.com/office/drawing/2015/10/21/chartex" xmlns:cx3="http://schemas.microsoft.com/office/drawing/2016/5/9/chartex" xmlns:cx4="http://schemas.microsoft.com/office/drawing/2016/5/10/chartex" xmlns:cx5="http://schemas.microsoft.com/office/drawing/2016/5/11/chartex" xmlns:cx6="http://schemas.microsoft.com/office/drawing/2016/5/12/chartex" xmlns:cx7="http://schemas.microsoft.com/office/drawing/2016/5/13/chartex" xmlns:cx8="http://schemas.microsoft.com/office/drawing/2016/5/14/chartex" xmlns:mc="http://schemas.openxmlformats.org/markup-compatibility/2006" xmlns:aink="http://schemas.microsoft.com/office/drawing/2016/ink" xmlns:am3d="http://schemas.microsoft.com/office/drawing/2017/model3d" xmlns:o="urn:schemas-microsoft-com:office:office" xmlns:oel="http://schemas.microsoft.com/office/2019/extlst" xmlns:r="http://schemas.openxmlformats.org/officeDocument/2006/relationships" xmlns:m="http://schemas.openxmlformats.org/officeDocument/2006/math" xmlns:v="urn:schemas-microsoft-com:vml" xmlns:wp14="http://schemas.microsoft.com/office/word/2010/wordprocessingDrawing" xmlns:wp="http://schemas.openxmlformats.org/drawingml/2006/wordprocessingDrawing" xmlns:w10="urn:schemas-microsoft-com:office:word" xmlns:w="http://schemas.openxmlformats.org/wordprocessingml/2006/main" xmlns:w14="http://schemas.microsoft.com/office/word/2010/wordml" xmlns:w15="http://schemas.microsoft.com/office/word/2012/wordml" xmlns:w16cex="http://schemas.microsoft.com/office/word/2018/wordml/cex" xmlns:w16cid="http://schemas.microsoft.com/office/word/2016/wordml/cid" xmlns:w16="http://schemas.microsoft.com/office/word/2018/wordml" xmlns:w16du="http://schemas.microsoft.com/office/word/2023/wordml/word16du" xmlns:w16sdtdh="http://schemas.microsoft.com/office/word/2020/wordml/sdtdatahash" xmlns:w16sdtfl="http://schemas.microsoft.com/office/word/2024/wordml/sdtformatlock" xmlns:w16se="http://schemas.microsoft.com/office/word/2015/wordml/symex" xmlns:wpg="http://schemas.microsoft.com/office/word/2010/wordprocessingGroup" xmlns:wpi="http://schemas.microsoft.com/office/word/2010/wordprocessingInk" xmlns:wne="http://schemas.microsoft.com/office/word/2006/wordml" xmlns:wps="http://schemas.microsoft.com/office/word/2010/wordprocessingShape" mc:Ignorable="w14 w15 w16se w16cid w16 w16cex w16sdtdh w16sdtfl w16du wp14">
   <w:p>
     <w:pPr>
       <w:pStyle w:val="ad"/>
@@ -16720,7 +16725,7 @@
 </file>
 
 <file path=word/footnotes.xml><?xml version="1.0" encoding="utf-8"?>
-<w:footnotes xmlns:wpc="http://schemas.microsoft.com/office/word/2010/wordprocessingCanvas" xmlns:cx="http://schemas.microsoft.com/office/drawing/2014/chartex" xmlns:cx1="http://schemas.microsoft.com/office/drawing/2015/9/8/chartex" xmlns:cx2="http://schemas.microsoft.com/office/drawing/2015/10/21/chartex" xmlns:cx3="http://schemas.microsoft.com/office/drawing/2016/5/9/chartex" xmlns:cx4="http://schemas.microsoft.com/office/drawing/2016/5/10/chartex" xmlns:cx5="http://schemas.microsoft.com/office/drawing/2016/5/11/chartex" xmlns:cx6="http://schemas.microsoft.com/office/drawing/2016/5/12/chartex" xmlns:cx7="http://schemas.microsoft.com/office/drawing/2016/5/13/chartex" xmlns:cx8="http://schemas.microsoft.com/office/drawing/2016/5/14/chartex" xmlns:mc="http://schemas.openxmlformats.org/markup-compatibility/2006" xmlns:aink="http://schemas.microsoft.com/office/drawing/2016/ink" xmlns:am3d="http://schemas.microsoft.com/office/drawing/2017/model3d" xmlns:o="urn:schemas-microsoft-com:office:office" xmlns:oel="http://schemas.microsoft.com/office/2019/extlst" xmlns:r="http://schemas.openxmlformats.org/officeDocument/2006/relationships" xmlns:m="http://schemas.openxmlformats.org/officeDocument/2006/math" xmlns:v="urn:schemas-microsoft-com:vml" xmlns:wp14="http://schemas.microsoft.com/office/word/2010/wordprocessingDrawing" xmlns:wp="http://schemas.openxmlformats.org/drawingml/2006/wordprocessingDrawing" xmlns:w10="urn:schemas-microsoft-com:office:word" xmlns:w="http://schemas.openxmlformats.org/wordprocessingml/2006/main" xmlns:w14="http://schemas.microsoft.com/office/word/2010/wordml" xmlns:w15="http://schemas.microsoft.com/office/word/2012/wordml" xmlns:w16cex="http://schemas.microsoft.com/office/word/2018/wordml/cex" xmlns:w16cid="http://schemas.microsoft.com/office/word/2016/wordml/cid" xmlns:w16="http://schemas.microsoft.com/office/word/2018/wordml" xmlns:w16sdtdh="http://schemas.microsoft.com/office/word/2020/wordml/sdtdatahash" xmlns:w16se="http://schemas.microsoft.com/office/word/2015/wordml/symex" xmlns:wpg="http://schemas.microsoft.com/office/word/2010/wordprocessingGroup" xmlns:wpi="http://schemas.microsoft.com/office/word/2010/wordprocessingInk" xmlns:wne="http://schemas.microsoft.com/office/word/2006/wordml" xmlns:wps="http://schemas.microsoft.com/office/word/2010/wordprocessingShape" mc:Ignorable="w14 w15 w16se w16cid w16 w16cex w16sdtdh wp14">
+<w:footnotes xmlns:wpc="http://schemas.microsoft.com/office/word/2010/wordprocessingCanvas" xmlns:cx="http://schemas.microsoft.com/office/drawing/2014/chartex" xmlns:cx1="http://schemas.microsoft.com/office/drawing/2015/9/8/chartex" xmlns:cx2="http://schemas.microsoft.com/office/drawing/2015/10/21/chartex" xmlns:cx3="http://schemas.microsoft.com/office/drawing/2016/5/9/chartex" xmlns:cx4="http://schemas.microsoft.com/office/drawing/2016/5/10/chartex" xmlns:cx5="http://schemas.microsoft.com/office/drawing/2016/5/11/chartex" xmlns:cx6="http://schemas.microsoft.com/office/drawing/2016/5/12/chartex" xmlns:cx7="http://schemas.microsoft.com/office/drawing/2016/5/13/chartex" xmlns:cx8="http://schemas.microsoft.com/office/drawing/2016/5/14/chartex" xmlns:mc="http://schemas.openxmlformats.org/markup-compatibility/2006" xmlns:aink="http://schemas.microsoft.com/office/drawing/2016/ink" xmlns:am3d="http://schemas.microsoft.com/office/drawing/2017/model3d" xmlns:o="urn:schemas-microsoft-com:office:office" xmlns:oel="http://schemas.microsoft.com/office/2019/extlst" xmlns:r="http://schemas.openxmlformats.org/officeDocument/2006/relationships" xmlns:m="http://schemas.openxmlformats.org/officeDocument/2006/math" xmlns:v="urn:schemas-microsoft-com:vml" xmlns:wp14="http://schemas.microsoft.com/office/word/2010/wordprocessingDrawing" xmlns:wp="http://schemas.openxmlformats.org/drawingml/2006/wordprocessingDrawing" xmlns:w10="urn:schemas-microsoft-com:office:word" xmlns:w="http://schemas.openxmlformats.org/wordprocessingml/2006/main" xmlns:w14="http://schemas.microsoft.com/office/word/2010/wordml" xmlns:w15="http://schemas.microsoft.com/office/word/2012/wordml" xmlns:w16cex="http://schemas.microsoft.com/office/word/2018/wordml/cex" xmlns:w16cid="http://schemas.microsoft.com/office/word/2016/wordml/cid" xmlns:w16="http://schemas.microsoft.com/office/word/2018/wordml" xmlns:w16du="http://schemas.microsoft.com/office/word/2023/wordml/word16du" xmlns:w16sdtdh="http://schemas.microsoft.com/office/word/2020/wordml/sdtdatahash" xmlns:w16sdtfl="http://schemas.microsoft.com/office/word/2024/wordml/sdtformatlock" xmlns:w16se="http://schemas.microsoft.com/office/word/2015/wordml/symex" xmlns:wpg="http://schemas.microsoft.com/office/word/2010/wordprocessingGroup" xmlns:wpi="http://schemas.microsoft.com/office/word/2010/wordprocessingInk" xmlns:wne="http://schemas.microsoft.com/office/word/2006/wordml" xmlns:wps="http://schemas.microsoft.com/office/word/2010/wordprocessingShape" mc:Ignorable="w14 w15 w16se w16cid w16 w16cex w16sdtdh w16sdtfl w16du wp14">
   <w:footnote w:type="separator" w:id="-1">
     <w:p>
       <w:r>
@@ -16739,7 +16744,7 @@
 </file>
 
 <file path=word/header1.xml><?xml version="1.0" encoding="utf-8"?>
-<w:hdr xmlns:wpc="http://schemas.microsoft.com/office/word/2010/wordprocessingCanvas" xmlns:cx="http://schemas.microsoft.com/office/drawing/2014/chartex" xmlns:cx1="http://schemas.microsoft.com/office/drawing/2015/9/8/chartex" xmlns:cx2="http://schemas.microsoft.com/office/drawing/2015/10/21/chartex" xmlns:cx3="http://schemas.microsoft.com/office/drawing/2016/5/9/chartex" xmlns:cx4="http://schemas.microsoft.com/office/drawing/2016/5/10/chartex" xmlns:cx5="http://schemas.microsoft.com/office/drawing/2016/5/11/chartex" xmlns:cx6="http://schemas.microsoft.com/office/drawing/2016/5/12/chartex" xmlns:cx7="http://schemas.microsoft.com/office/drawing/2016/5/13/chartex" xmlns:cx8="http://schemas.microsoft.com/office/drawing/2016/5/14/chartex" xmlns:mc="http://schemas.openxmlformats.org/markup-compatibility/2006" xmlns:aink="http://schemas.microsoft.com/office/drawing/2016/ink" xmlns:am3d="http://schemas.microsoft.com/office/drawing/2017/model3d" xmlns:o="urn:schemas-microsoft-com:office:office" xmlns:oel="http://schemas.microsoft.com/office/2019/extlst" xmlns:r="http://schemas.openxmlformats.org/officeDocument/2006/relationships" xmlns:m="http://schemas.openxmlformats.org/officeDocument/2006/math" xmlns:v="urn:schemas-microsoft-com:vml" xmlns:wp14="http://schemas.microsoft.com/office/word/2010/wordprocessingDrawing" xmlns:wp="http://schemas.openxmlformats.org/drawingml/2006/wordprocessingDrawing" xmlns:w10="urn:schemas-microsoft-com:office:word" xmlns:w="http://schemas.openxmlformats.org/wordprocessingml/2006/main" xmlns:w14="http://schemas.microsoft.com/office/word/2010/wordml" xmlns:w15="http://schemas.microsoft.com/office/word/2012/wordml" xmlns:w16cex="http://schemas.microsoft.com/office/word/2018/wordml/cex" xmlns:w16cid="http://schemas.microsoft.com/office/word/2016/wordml/cid" xmlns:w16="http://schemas.microsoft.com/office/word/2018/wordml" xmlns:w16sdtdh="http://schemas.microsoft.com/office/word/2020/wordml/sdtdatahash" xmlns:w16se="http://schemas.microsoft.com/office/word/2015/wordml/symex" xmlns:wpg="http://schemas.microsoft.com/office/word/2010/wordprocessingGroup" xmlns:wpi="http://schemas.microsoft.com/office/word/2010/wordprocessingInk" xmlns:wne="http://schemas.microsoft.com/office/word/2006/wordml" xmlns:wps="http://schemas.microsoft.com/office/word/2010/wordprocessingShape" mc:Ignorable="w14 w15 w16se w16cid w16 w16cex w16sdtdh wp14">
+<w:hdr xmlns:wpc="http://schemas.microsoft.com/office/word/2010/wordprocessingCanvas" xmlns:cx="http://schemas.microsoft.com/office/drawing/2014/chartex" xmlns:cx1="http://schemas.microsoft.com/office/drawing/2015/9/8/chartex" xmlns:cx2="http://schemas.microsoft.com/office/drawing/2015/10/21/chartex" xmlns:cx3="http://schemas.microsoft.com/office/drawing/2016/5/9/chartex" xmlns:cx4="http://schemas.microsoft.com/office/drawing/2016/5/10/chartex" xmlns:cx5="http://schemas.microsoft.com/office/drawing/2016/5/11/chartex" xmlns:cx6="http://schemas.microsoft.com/office/drawing/2016/5/12/chartex" xmlns:cx7="http://schemas.microsoft.com/office/drawing/2016/5/13/chartex" xmlns:cx8="http://schemas.microsoft.com/office/drawing/2016/5/14/chartex" xmlns:mc="http://schemas.openxmlformats.org/markup-compatibility/2006" xmlns:aink="http://schemas.microsoft.com/office/drawing/2016/ink" xmlns:am3d="http://schemas.microsoft.com/office/drawing/2017/model3d" xmlns:o="urn:schemas-microsoft-com:office:office" xmlns:oel="http://schemas.microsoft.com/office/2019/extlst" xmlns:r="http://schemas.openxmlformats.org/officeDocument/2006/relationships" xmlns:m="http://schemas.openxmlformats.org/officeDocument/2006/math" xmlns:v="urn:schemas-microsoft-com:vml" xmlns:wp14="http://schemas.microsoft.com/office/word/2010/wordprocessingDrawing" xmlns:wp="http://schemas.openxmlformats.org/drawingml/2006/wordprocessingDrawing" xmlns:w10="urn:schemas-microsoft-com:office:word" xmlns:w="http://schemas.openxmlformats.org/wordprocessingml/2006/main" xmlns:w14="http://schemas.microsoft.com/office/word/2010/wordml" xmlns:w15="http://schemas.microsoft.com/office/word/2012/wordml" xmlns:w16cex="http://schemas.microsoft.com/office/word/2018/wordml/cex" xmlns:w16cid="http://schemas.microsoft.com/office/word/2016/wordml/cid" xmlns:w16="http://schemas.microsoft.com/office/word/2018/wordml" xmlns:w16du="http://schemas.microsoft.com/office/word/2023/wordml/word16du" xmlns:w16sdtdh="http://schemas.microsoft.com/office/word/2020/wordml/sdtdatahash" xmlns:w16sdtfl="http://schemas.microsoft.com/office/word/2024/wordml/sdtformatlock" xmlns:w16se="http://schemas.microsoft.com/office/word/2015/wordml/symex" xmlns:wpg="http://schemas.microsoft.com/office/word/2010/wordprocessingGroup" xmlns:wpi="http://schemas.microsoft.com/office/word/2010/wordprocessingInk" xmlns:wne="http://schemas.microsoft.com/office/word/2006/wordml" xmlns:wps="http://schemas.microsoft.com/office/word/2010/wordprocessingShape" mc:Ignorable="w14 w15 w16se w16cid w16 w16cex w16sdtdh w16sdtfl w16du wp14">
   <w:p>
     <w:pPr>
       <w:pStyle w:val="ac"/>
@@ -16750,7 +16755,7 @@
 </file>
 
 <file path=word/numbering.xml><?xml version="1.0" encoding="utf-8"?>
-<w:numbering xmlns:wpc="http://schemas.microsoft.com/office/word/2010/wordprocessingCanvas" xmlns:cx="http://schemas.microsoft.com/office/drawing/2014/chartex" xmlns:cx1="http://schemas.microsoft.com/office/drawing/2015/9/8/chartex" xmlns:cx2="http://schemas.microsoft.com/office/drawing/2015/10/21/chartex" xmlns:cx3="http://schemas.microsoft.com/office/drawing/2016/5/9/chartex" xmlns:cx4="http://schemas.microsoft.com/office/drawing/2016/5/10/chartex" xmlns:cx5="http://schemas.microsoft.com/office/drawing/2016/5/11/chartex" xmlns:cx6="http://schemas.microsoft.com/office/drawing/2016/5/12/chartex" xmlns:cx7="http://schemas.microsoft.com/office/drawing/2016/5/13/chartex" xmlns:cx8="http://schemas.microsoft.com/office/drawing/2016/5/14/chartex" xmlns:mc="http://schemas.openxmlformats.org/markup-compatibility/2006" xmlns:aink="http://schemas.microsoft.com/office/drawing/2016/ink" xmlns:am3d="http://schemas.microsoft.com/office/drawing/2017/model3d" xmlns:o="urn:schemas-microsoft-com:office:office" xmlns:oel="http://schemas.microsoft.com/office/2019/extlst" xmlns:r="http://schemas.openxmlformats.org/officeDocument/2006/relationships" xmlns:m="http://schemas.openxmlformats.org/officeDocument/2006/math" xmlns:v="urn:schemas-microsoft-com:vml" xmlns:wp14="http://schemas.microsoft.com/office/word/2010/wordprocessingDrawing" xmlns:wp="http://schemas.openxmlformats.org/drawingml/2006/wordprocessingDrawing" xmlns:w10="urn:schemas-microsoft-com:office:word" xmlns:w="http://schemas.openxmlformats.org/wordprocessingml/2006/main" xmlns:w14="http://schemas.microsoft.com/office/word/2010/wordml" xmlns:w15="http://schemas.microsoft.com/office/word/2012/wordml" xmlns:w16cex="http://schemas.microsoft.com/office/word/2018/wordml/cex" xmlns:w16cid="http://schemas.microsoft.com/office/word/2016/wordml/cid" xmlns:w16="http://schemas.microsoft.com/office/word/2018/wordml" xmlns:w16sdtdh="http://schemas.microsoft.com/office/word/2020/wordml/sdtdatahash" xmlns:w16se="http://schemas.microsoft.com/office/word/2015/wordml/symex" xmlns:wpg="http://schemas.microsoft.com/office/word/2010/wordprocessingGroup" xmlns:wpi="http://schemas.microsoft.com/office/word/2010/wordprocessingInk" xmlns:wne="http://schemas.microsoft.com/office/word/2006/wordml" xmlns:wps="http://schemas.microsoft.com/office/word/2010/wordprocessingShape" mc:Ignorable="w14 w15 w16se w16cid w16 w16cex w16sdtdh wp14">
+<w:numbering xmlns:wpc="http://schemas.microsoft.com/office/word/2010/wordprocessingCanvas" xmlns:cx="http://schemas.microsoft.com/office/drawing/2014/chartex" xmlns:cx1="http://schemas.microsoft.com/office/drawing/2015/9/8/chartex" xmlns:cx2="http://schemas.microsoft.com/office/drawing/2015/10/21/chartex" xmlns:cx3="http://schemas.microsoft.com/office/drawing/2016/5/9/chartex" xmlns:cx4="http://schemas.microsoft.com/office/drawing/2016/5/10/chartex" xmlns:cx5="http://schemas.microsoft.com/office/drawing/2016/5/11/chartex" xmlns:cx6="http://schemas.microsoft.com/office/drawing/2016/5/12/chartex" xmlns:cx7="http://schemas.microsoft.com/office/drawing/2016/5/13/chartex" xmlns:cx8="http://schemas.microsoft.com/office/drawing/2016/5/14/chartex" xmlns:mc="http://schemas.openxmlformats.org/markup-compatibility/2006" xmlns:aink="http://schemas.microsoft.com/office/drawing/2016/ink" xmlns:am3d="http://schemas.microsoft.com/office/drawing/2017/model3d" xmlns:o="urn:schemas-microsoft-com:office:office" xmlns:oel="http://schemas.microsoft.com/office/2019/extlst" xmlns:r="http://schemas.openxmlformats.org/officeDocument/2006/relationships" xmlns:m="http://schemas.openxmlformats.org/officeDocument/2006/math" xmlns:v="urn:schemas-microsoft-com:vml" xmlns:wp14="http://schemas.microsoft.com/office/word/2010/wordprocessingDrawing" xmlns:wp="http://schemas.openxmlformats.org/drawingml/2006/wordprocessingDrawing" xmlns:w10="urn:schemas-microsoft-com:office:word" xmlns:w="http://schemas.openxmlformats.org/wordprocessingml/2006/main" xmlns:w14="http://schemas.microsoft.com/office/word/2010/wordml" xmlns:w15="http://schemas.microsoft.com/office/word/2012/wordml" xmlns:w16cex="http://schemas.microsoft.com/office/word/2018/wordml/cex" xmlns:w16cid="http://schemas.microsoft.com/office/word/2016/wordml/cid" xmlns:w16="http://schemas.microsoft.com/office/word/2018/wordml" xmlns:w16du="http://schemas.microsoft.com/office/word/2023/wordml/word16du" xmlns:w16sdtdh="http://schemas.microsoft.com/office/word/2020/wordml/sdtdatahash" xmlns:w16sdtfl="http://schemas.microsoft.com/office/word/2024/wordml/sdtformatlock" xmlns:w16se="http://schemas.microsoft.com/office/word/2015/wordml/symex" xmlns:wpg="http://schemas.microsoft.com/office/word/2010/wordprocessingGroup" xmlns:wpi="http://schemas.microsoft.com/office/word/2010/wordprocessingInk" xmlns:wne="http://schemas.microsoft.com/office/word/2006/wordml" xmlns:wps="http://schemas.microsoft.com/office/word/2010/wordprocessingShape" mc:Ignorable="w14 w15 w16se w16cid w16 w16cex w16sdtdh w16sdtfl w16du wp14">
   <w:abstractNum w:abstractNumId="0" w15:restartNumberingAfterBreak="0">
     <w:nsid w:val="13350236"/>
     <w:multiLevelType w:val="hybridMultilevel"/>
@@ -18332,7 +18337,7 @@
 </file>
 
 <file path=word/styles.xml><?xml version="1.0" encoding="utf-8"?>
-<w:styles xmlns:mc="http://schemas.openxmlformats.org/markup-compatibility/2006" xmlns:r="http://schemas.openxmlformats.org/officeDocument/2006/relationships" xmlns:w="http://schemas.openxmlformats.org/wordprocessingml/2006/main" xmlns:w14="http://schemas.microsoft.com/office/word/2010/wordml" xmlns:w15="http://schemas.microsoft.com/office/word/2012/wordml" xmlns:w16cex="http://schemas.microsoft.com/office/word/2018/wordml/cex" xmlns:w16cid="http://schemas.microsoft.com/office/word/2016/wordml/cid" xmlns:w16="http://schemas.microsoft.com/office/word/2018/wordml" xmlns:w16sdtdh="http://schemas.microsoft.com/office/word/2020/wordml/sdtdatahash" xmlns:w16se="http://schemas.microsoft.com/office/word/2015/wordml/symex" mc:Ignorable="w14 w15 w16se w16cid w16 w16cex w16sdtdh">
+<w:styles xmlns:mc="http://schemas.openxmlformats.org/markup-compatibility/2006" xmlns:r="http://schemas.openxmlformats.org/officeDocument/2006/relationships" xmlns:w="http://schemas.openxmlformats.org/wordprocessingml/2006/main" xmlns:w14="http://schemas.microsoft.com/office/word/2010/wordml" xmlns:w15="http://schemas.microsoft.com/office/word/2012/wordml" xmlns:w16cex="http://schemas.microsoft.com/office/word/2018/wordml/cex" xmlns:w16cid="http://schemas.microsoft.com/office/word/2016/wordml/cid" xmlns:w16="http://schemas.microsoft.com/office/word/2018/wordml" xmlns:w16du="http://schemas.microsoft.com/office/word/2023/wordml/word16du" xmlns:w16sdtdh="http://schemas.microsoft.com/office/word/2020/wordml/sdtdatahash" xmlns:w16sdtfl="http://schemas.microsoft.com/office/word/2024/wordml/sdtformatlock" xmlns:w16se="http://schemas.microsoft.com/office/word/2015/wordml/symex" mc:Ignorable="w14 w15 w16se w16cid w16 w16cex w16sdtdh w16sdtfl w16du">
   <w:docDefaults>
     <w:rPrDefault>
       <w:rPr>
@@ -18897,7 +18902,6 @@
   <w:style w:type="character" w:default="1" w:styleId="a0">
     <w:name w:val="Default Paragraph Font"/>
     <w:uiPriority w:val="1"/>
-    <w:semiHidden/>
     <w:unhideWhenUsed/>
   </w:style>
   <w:style w:type="table" w:default="1" w:styleId="a1">

</xml_diff>